<commit_message>
user cases 1-2 updated and v1.0 created
</commit_message>
<xml_diff>
--- a/Use_cases_1_2_ODY_v0.3.docx
+++ b/Use_cases_1_2_ODY_v0.3.docx
@@ -696,12 +696,56 @@
           <w:szCs w:val="28"/>
           <w:lang w:val="el-GR"/>
         </w:rPr>
-        <w:t xml:space="preserve"> και </w:t>
-      </w:r>
-      <w:r>
-        <w:rPr>
-          <w:sz w:val="28"/>
-          <w:szCs w:val="28"/>
+        <w:t xml:space="preserve"> </w:t>
+      </w:r>
+      <w:r>
+        <w:rPr>
+          <w:strike/>
+          <w:sz w:val="28"/>
+          <w:szCs w:val="28"/>
+          <w:lang w:val="el-GR"/>
+        </w:rPr>
+        <w:t>και πατάει το κουμπί “</w:t>
+      </w:r>
+      <w:r>
+        <w:rPr>
+          <w:strike/>
+          <w:sz w:val="28"/>
+          <w:szCs w:val="28"/>
+        </w:rPr>
+        <w:t>Search</w:t>
+      </w:r>
+      <w:r>
+        <w:rPr>
+          <w:strike/>
+          <w:sz w:val="28"/>
+          <w:szCs w:val="28"/>
+          <w:lang w:val="el-GR"/>
+        </w:rPr>
+        <w:t>”</w:t>
+      </w:r>
+      <w:r>
+        <w:rPr>
+          <w:sz w:val="28"/>
+          <w:szCs w:val="28"/>
+          <w:lang w:val="el-GR"/>
+        </w:rPr>
+        <w:t xml:space="preserve"> </w:t>
+      </w:r>
+      <w:r>
+        <w:rPr>
+          <w:sz w:val="28"/>
+          <w:szCs w:val="28"/>
+          <w:highlight w:val="red"/>
+          <w:lang w:val="el-GR"/>
+        </w:rPr>
+        <w:t xml:space="preserve">και </w:t>
+      </w:r>
+      <w:r>
+        <w:rPr>
+          <w:sz w:val="28"/>
+          <w:szCs w:val="28"/>
+          <w:highlight w:val="red"/>
           <w:lang w:val="el-GR"/>
         </w:rPr>
         <w:t xml:space="preserve">εκτελεί αναζήτηση πατώντας </w:t>
@@ -710,8 +754,36 @@
         <w:rPr>
           <w:sz w:val="28"/>
           <w:szCs w:val="28"/>
+          <w:highlight w:val="red"/>
         </w:rPr>
         <w:t>enter</w:t>
+      </w:r>
+      <w:r>
+        <w:rPr>
+          <w:sz w:val="28"/>
+          <w:szCs w:val="28"/>
+          <w:highlight w:val="red"/>
+          <w:lang w:val="el-GR"/>
+        </w:rPr>
+        <w:t xml:space="preserve"> στην </w:t>
+      </w:r>
+      <w:r>
+        <w:rPr>
+          <w:sz w:val="28"/>
+          <w:szCs w:val="28"/>
+          <w:highlight w:val="red"/>
+          <w:lang w:val="el-GR"/>
+        </w:rPr>
+        <w:t>γραμμή</w:t>
+      </w:r>
+      <w:r>
+        <w:rPr>
+          <w:sz w:val="28"/>
+          <w:szCs w:val="28"/>
+          <w:highlight w:val="red"/>
+          <w:lang w:val="el-GR"/>
+        </w:rPr>
+        <w:t xml:space="preserve"> αναζήτησης</w:t>
       </w:r>
       <w:r>
         <w:rPr>
@@ -1052,6 +1124,7 @@
       </w:r>
       <w:r>
         <w:rPr>
+          <w:strike/>
           <w:sz w:val="28"/>
           <w:szCs w:val="28"/>
           <w:lang w:val="el-GR"/>
@@ -1060,6 +1133,7 @@
       </w:r>
       <w:r>
         <w:rPr>
+          <w:strike/>
           <w:sz w:val="28"/>
           <w:szCs w:val="28"/>
         </w:rPr>
@@ -1067,6 +1141,7 @@
       </w:r>
       <w:r>
         <w:rPr>
+          <w:strike/>
           <w:sz w:val="28"/>
           <w:szCs w:val="28"/>
           <w:lang w:val="el-GR"/>
@@ -1077,6 +1152,74 @@
         <w:rPr>
           <w:sz w:val="28"/>
           <w:szCs w:val="28"/>
+          <w:lang w:val="el-GR"/>
+        </w:rPr>
+        <w:t xml:space="preserve"> </w:t>
+      </w:r>
+      <w:r>
+        <w:rPr>
+          <w:sz w:val="28"/>
+          <w:szCs w:val="28"/>
+          <w:highlight w:val="red"/>
+          <w:lang w:val="el-GR"/>
+        </w:rPr>
+        <w:t>“</w:t>
+      </w:r>
+      <w:r>
+        <w:rPr>
+          <w:sz w:val="28"/>
+          <w:szCs w:val="28"/>
+          <w:highlight w:val="red"/>
+        </w:rPr>
+        <w:t>S</w:t>
+      </w:r>
+      <w:r>
+        <w:rPr>
+          <w:sz w:val="28"/>
+          <w:szCs w:val="28"/>
+          <w:highlight w:val="red"/>
+        </w:rPr>
+        <w:t>end</w:t>
+      </w:r>
+      <w:r>
+        <w:rPr>
+          <w:sz w:val="28"/>
+          <w:szCs w:val="28"/>
+          <w:highlight w:val="red"/>
+          <w:lang w:val="el-GR"/>
+        </w:rPr>
+        <w:t xml:space="preserve"> </w:t>
+      </w:r>
+      <w:r>
+        <w:rPr>
+          <w:sz w:val="28"/>
+          <w:szCs w:val="28"/>
+          <w:highlight w:val="red"/>
+        </w:rPr>
+        <w:t>R</w:t>
+      </w:r>
+      <w:r>
+        <w:rPr>
+          <w:sz w:val="28"/>
+          <w:szCs w:val="28"/>
+          <w:highlight w:val="red"/>
+        </w:rPr>
+        <w:t>equest</w:t>
+      </w:r>
+      <w:r>
+        <w:rPr>
+          <w:sz w:val="28"/>
+          <w:szCs w:val="28"/>
+          <w:highlight w:val="red"/>
+          <w:lang w:val="el-GR"/>
+        </w:rPr>
+        <w:t>”</w:t>
+      </w:r>
+      <w:r>
+        <w:rPr>
+          <w:sz w:val="28"/>
+          <w:szCs w:val="28"/>
+          <w:highlight w:val="red"/>
           <w:lang w:val="el-GR"/>
         </w:rPr>
         <w:t>.</w:t>
@@ -1142,12 +1285,81 @@
           <w:szCs w:val="28"/>
           <w:lang w:val="el-GR"/>
         </w:rPr>
-        <w:t xml:space="preserve"> χρήστη στην ενότητα “</w:t>
-      </w:r>
-      <w:r>
-        <w:rPr>
-          <w:sz w:val="28"/>
-          <w:szCs w:val="28"/>
+        <w:t xml:space="preserve"> χρήστη στην ενότητα</w:t>
+      </w:r>
+      <w:r>
+        <w:rPr>
+          <w:sz w:val="28"/>
+          <w:szCs w:val="28"/>
+          <w:lang w:val="el-GR"/>
+        </w:rPr>
+        <w:t xml:space="preserve"> </w:t>
+      </w:r>
+      <w:r>
+        <w:rPr>
+          <w:strike/>
+          <w:sz w:val="28"/>
+          <w:szCs w:val="28"/>
+          <w:lang w:val="el-GR"/>
+        </w:rPr>
+        <w:t>“</w:t>
+      </w:r>
+      <w:r>
+        <w:rPr>
+          <w:strike/>
+          <w:sz w:val="28"/>
+          <w:szCs w:val="28"/>
+        </w:rPr>
+        <w:t>My</w:t>
+      </w:r>
+      <w:r>
+        <w:rPr>
+          <w:strike/>
+          <w:sz w:val="28"/>
+          <w:szCs w:val="28"/>
+          <w:lang w:val="el-GR"/>
+        </w:rPr>
+        <w:t xml:space="preserve"> </w:t>
+      </w:r>
+      <w:r>
+        <w:rPr>
+          <w:strike/>
+          <w:sz w:val="28"/>
+          <w:szCs w:val="28"/>
+        </w:rPr>
+        <w:t>Applications</w:t>
+      </w:r>
+      <w:r>
+        <w:rPr>
+          <w:strike/>
+          <w:sz w:val="28"/>
+          <w:szCs w:val="28"/>
+          <w:lang w:val="el-GR"/>
+        </w:rPr>
+        <w:t>”</w:t>
+      </w:r>
+      <w:r>
+        <w:rPr>
+          <w:sz w:val="28"/>
+          <w:szCs w:val="28"/>
+          <w:lang w:val="el-GR"/>
+        </w:rPr>
+        <w:t xml:space="preserve"> </w:t>
+      </w:r>
+      <w:r>
+        <w:rPr>
+          <w:sz w:val="28"/>
+          <w:szCs w:val="28"/>
+          <w:highlight w:val="red"/>
+          <w:lang w:val="el-GR"/>
+        </w:rPr>
+        <w:t>“</w:t>
+      </w:r>
+      <w:r>
+        <w:rPr>
+          <w:sz w:val="28"/>
+          <w:szCs w:val="28"/>
+          <w:highlight w:val="red"/>
         </w:rPr>
         <w:t>Requests</w:t>
       </w:r>
@@ -1155,9 +1367,18 @@
         <w:rPr>
           <w:sz w:val="28"/>
           <w:szCs w:val="28"/>
-          <w:lang w:val="el-GR"/>
-        </w:rPr>
-        <w:t xml:space="preserve">” </w:t>
+          <w:highlight w:val="red"/>
+          <w:lang w:val="el-GR"/>
+        </w:rPr>
+        <w:t>”</w:t>
+      </w:r>
+      <w:r>
+        <w:rPr>
+          <w:sz w:val="28"/>
+          <w:szCs w:val="28"/>
+          <w:lang w:val="el-GR"/>
+        </w:rPr>
+        <w:t xml:space="preserve"> </w:t>
       </w:r>
       <w:r>
         <w:rPr>
@@ -1239,7 +1460,18 @@
           <w:highlight w:val="yellow"/>
           <w:lang w:val="el-GR"/>
         </w:rPr>
-        <w:t>και αποστέλλει</w:t>
+        <w:t xml:space="preserve">και </w:t>
+      </w:r>
+      <w:r>
+        <w:rPr>
+          <w:strike/>
+          <w:sz w:val="28"/>
+          <w:szCs w:val="28"/>
+          <w:highlight w:val="yellow"/>
+          <w:lang w:val="el-GR"/>
+        </w:rPr>
+        <w:lastRenderedPageBreak/>
+        <w:t>αποστέλλει</w:t>
       </w:r>
       <w:r>
         <w:rPr>
@@ -1350,32 +1582,72 @@
     </w:p>
     <w:p>
       <w:pPr>
-        <w:rPr>
-          <w:sz w:val="28"/>
-          <w:szCs w:val="28"/>
-          <w:lang w:val="el-GR"/>
-        </w:rPr>
-      </w:pPr>
+        <w:pStyle w:val="Default"/>
+        <w:numPr>
+          <w:ilvl w:val="0"/>
+          <w:numId w:val="7"/>
+        </w:numPr>
+        <w:rPr>
+          <w:strike/>
+          <w:sz w:val="28"/>
+          <w:szCs w:val="28"/>
+          <w:lang w:val="el-GR"/>
+        </w:rPr>
+      </w:pPr>
+      <w:r>
+        <w:rPr>
+          <w:strike/>
+          <w:sz w:val="28"/>
+          <w:szCs w:val="28"/>
+          <w:lang w:val="el-GR"/>
+        </w:rPr>
+        <w:t>Το σύστημα ανανεώνει την οθόνη της αγγελίας, αλλάζοντας την κατάσταση του κουμπιού σε “</w:t>
+      </w:r>
+      <w:r>
+        <w:rPr>
+          <w:strike/>
+          <w:sz w:val="28"/>
+          <w:szCs w:val="28"/>
+        </w:rPr>
+        <w:t>Cancel</w:t>
+      </w:r>
+      <w:r>
+        <w:rPr>
+          <w:strike/>
+          <w:sz w:val="28"/>
+          <w:szCs w:val="28"/>
+          <w:lang w:val="el-GR"/>
+        </w:rPr>
+        <w:t xml:space="preserve"> </w:t>
+      </w:r>
+      <w:r>
+        <w:rPr>
+          <w:strike/>
+          <w:sz w:val="28"/>
+          <w:szCs w:val="28"/>
+        </w:rPr>
+        <w:t>Application</w:t>
+      </w:r>
+      <w:r>
+        <w:rPr>
+          <w:strike/>
+          <w:sz w:val="28"/>
+          <w:szCs w:val="28"/>
+          <w:lang w:val="el-GR"/>
+        </w:rPr>
+        <w:t xml:space="preserve">”. </w:t>
+      </w:r>
     </w:p>
     <w:p>
       <w:pPr>
-        <w:rPr>
-          <w:sz w:val="28"/>
-          <w:szCs w:val="28"/>
-          <w:u w:val="single"/>
-          <w:lang w:val="el-GR"/>
-        </w:rPr>
-      </w:pPr>
-      <w:r>
-        <w:rPr>
-          <w:sz w:val="28"/>
-          <w:szCs w:val="28"/>
-          <w:u w:val="single"/>
-          <w:lang w:val="el-GR"/>
-        </w:rPr>
-        <w:lastRenderedPageBreak/>
-        <w:t>Εναλλακτική Ροή 1:</w:t>
-      </w:r>
+        <w:pStyle w:val="ListParagraph"/>
+        <w:ind w:left="630"/>
+        <w:rPr>
+          <w:sz w:val="28"/>
+          <w:szCs w:val="28"/>
+          <w:lang w:val="el-GR"/>
+        </w:rPr>
+      </w:pPr>
     </w:p>
     <w:p>
       <w:pPr>
@@ -1385,211 +1657,24 @@
           <w:lang w:val="el-GR"/>
         </w:rPr>
       </w:pPr>
-      <w:r>
-        <w:rPr>
-          <w:sz w:val="28"/>
-          <w:szCs w:val="28"/>
-          <w:lang w:val="el-GR"/>
-        </w:rPr>
-        <w:t>4</w:t>
-      </w:r>
-      <w:r>
-        <w:rPr>
-          <w:sz w:val="28"/>
-          <w:szCs w:val="28"/>
-          <w:lang w:val="el-GR"/>
-        </w:rPr>
-        <w:t>.</w:t>
-      </w:r>
-      <w:r>
-        <w:rPr>
-          <w:sz w:val="28"/>
-          <w:szCs w:val="28"/>
-          <w:lang w:val="el-GR"/>
-        </w:rPr>
-        <w:t>α</w:t>
-      </w:r>
-      <w:r>
-        <w:rPr>
-          <w:sz w:val="28"/>
-          <w:szCs w:val="28"/>
-          <w:lang w:val="el-GR"/>
-        </w:rPr>
-        <w:t>.1</w:t>
-      </w:r>
-      <w:r>
-        <w:rPr>
-          <w:sz w:val="28"/>
-          <w:szCs w:val="28"/>
-          <w:lang w:val="el-GR"/>
-        </w:rPr>
-        <w:t>.</w:t>
-      </w:r>
-      <w:r>
-        <w:rPr>
-          <w:sz w:val="28"/>
-          <w:szCs w:val="28"/>
-          <w:lang w:val="el-GR"/>
-        </w:rPr>
-        <w:t xml:space="preserve"> </w:t>
-      </w:r>
-      <w:r>
-        <w:rPr>
-          <w:sz w:val="28"/>
-          <w:szCs w:val="28"/>
-          <w:lang w:val="el-GR"/>
-        </w:rPr>
-        <w:t xml:space="preserve">Το σύστημα επιστρέφει </w:t>
-      </w:r>
-      <w:r>
-        <w:rPr>
-          <w:sz w:val="28"/>
-          <w:szCs w:val="28"/>
-          <w:lang w:val="el-GR"/>
-        </w:rPr>
-        <w:t>“</w:t>
-      </w:r>
-      <w:r>
-        <w:rPr>
-          <w:sz w:val="28"/>
-          <w:szCs w:val="28"/>
-        </w:rPr>
-        <w:t>No</w:t>
-      </w:r>
-      <w:r>
-        <w:rPr>
-          <w:sz w:val="28"/>
-          <w:szCs w:val="28"/>
-          <w:lang w:val="el-GR"/>
-        </w:rPr>
-        <w:t xml:space="preserve"> </w:t>
-      </w:r>
-      <w:r>
-        <w:rPr>
-          <w:sz w:val="28"/>
-          <w:szCs w:val="28"/>
-        </w:rPr>
-        <w:t>results</w:t>
-      </w:r>
-      <w:r>
-        <w:rPr>
-          <w:sz w:val="28"/>
-          <w:szCs w:val="28"/>
-          <w:lang w:val="el-GR"/>
-        </w:rPr>
-        <w:t xml:space="preserve"> </w:t>
-      </w:r>
-      <w:r>
-        <w:rPr>
-          <w:sz w:val="28"/>
-          <w:szCs w:val="28"/>
-        </w:rPr>
-        <w:t>found</w:t>
-      </w:r>
-      <w:r>
-        <w:rPr>
-          <w:sz w:val="28"/>
-          <w:szCs w:val="28"/>
-          <w:lang w:val="el-GR"/>
-        </w:rPr>
-        <w:t>”</w:t>
-      </w:r>
-      <w:r>
-        <w:rPr>
-          <w:sz w:val="28"/>
-          <w:szCs w:val="28"/>
-          <w:lang w:val="el-GR"/>
-        </w:rPr>
-        <w:t xml:space="preserve"> σε περίπτωση που δεν υπάρχουν αγγελίες </w:t>
-      </w:r>
-      <w:r>
-        <w:rPr>
-          <w:sz w:val="28"/>
-          <w:szCs w:val="28"/>
-          <w:lang w:val="el-GR"/>
-        </w:rPr>
-        <w:t>που</w:t>
-      </w:r>
-      <w:r>
-        <w:rPr>
-          <w:sz w:val="28"/>
-          <w:szCs w:val="28"/>
-          <w:lang w:val="el-GR"/>
-        </w:rPr>
-        <w:t xml:space="preserve"> να</w:t>
-      </w:r>
-      <w:r>
-        <w:rPr>
-          <w:sz w:val="28"/>
-          <w:szCs w:val="28"/>
-          <w:lang w:val="el-GR"/>
-        </w:rPr>
-        <w:t xml:space="preserve"> ταιριάζουν στα κριτήρια</w:t>
-      </w:r>
-      <w:r>
-        <w:rPr>
-          <w:sz w:val="28"/>
-          <w:szCs w:val="28"/>
-          <w:lang w:val="el-GR"/>
-        </w:rPr>
-        <w:t xml:space="preserve"> του χρήστη.</w:t>
-      </w:r>
     </w:p>
     <w:p>
       <w:pPr>
         <w:rPr>
           <w:sz w:val="28"/>
           <w:szCs w:val="28"/>
-          <w:lang w:val="el-GR"/>
-        </w:rPr>
-      </w:pPr>
-      <w:r>
-        <w:rPr>
-          <w:sz w:val="28"/>
-          <w:szCs w:val="28"/>
-          <w:lang w:val="el-GR"/>
-        </w:rPr>
-        <w:t>4</w:t>
-      </w:r>
-      <w:r>
-        <w:rPr>
-          <w:sz w:val="28"/>
-          <w:szCs w:val="28"/>
-          <w:lang w:val="el-GR"/>
-        </w:rPr>
-        <w:t xml:space="preserve">.α.2. </w:t>
-      </w:r>
-      <w:r>
-        <w:rPr>
-          <w:sz w:val="28"/>
-          <w:szCs w:val="28"/>
-          <w:lang w:val="el-GR"/>
-        </w:rPr>
-        <w:t xml:space="preserve">Η περίπτωση χρήσης επιστρέφει στο βήμα </w:t>
-      </w:r>
-      <w:r>
-        <w:rPr>
-          <w:sz w:val="28"/>
-          <w:szCs w:val="28"/>
-          <w:lang w:val="el-GR"/>
-        </w:rPr>
-        <w:t>3</w:t>
-      </w:r>
-      <w:r>
-        <w:rPr>
-          <w:sz w:val="28"/>
-          <w:szCs w:val="28"/>
-          <w:lang w:val="el-GR"/>
-        </w:rPr>
-        <w:t xml:space="preserve"> </w:t>
-      </w:r>
-      <w:r>
-        <w:rPr>
-          <w:sz w:val="28"/>
-          <w:szCs w:val="28"/>
-          <w:lang w:val="el-GR"/>
-        </w:rPr>
-        <w:t>της βασικής ροής.</w:t>
+          <w:u w:val="single"/>
+          <w:lang w:val="el-GR"/>
+        </w:rPr>
+      </w:pPr>
+      <w:r>
+        <w:rPr>
+          <w:sz w:val="28"/>
+          <w:szCs w:val="28"/>
+          <w:u w:val="single"/>
+          <w:lang w:val="el-GR"/>
+        </w:rPr>
+        <w:t>Εναλλακτική Ροή 1:</w:t>
       </w:r>
     </w:p>
     <w:p>
@@ -1597,6 +1682,347 @@
         <w:rPr>
           <w:sz w:val="28"/>
           <w:szCs w:val="28"/>
+          <w:lang w:val="el-GR"/>
+        </w:rPr>
+      </w:pPr>
+      <w:r>
+        <w:rPr>
+          <w:sz w:val="28"/>
+          <w:szCs w:val="28"/>
+          <w:lang w:val="el-GR"/>
+        </w:rPr>
+        <w:t>4</w:t>
+      </w:r>
+      <w:r>
+        <w:rPr>
+          <w:sz w:val="28"/>
+          <w:szCs w:val="28"/>
+          <w:lang w:val="el-GR"/>
+        </w:rPr>
+        <w:t>.</w:t>
+      </w:r>
+      <w:r>
+        <w:rPr>
+          <w:sz w:val="28"/>
+          <w:szCs w:val="28"/>
+          <w:lang w:val="el-GR"/>
+        </w:rPr>
+        <w:t>α</w:t>
+      </w:r>
+      <w:r>
+        <w:rPr>
+          <w:sz w:val="28"/>
+          <w:szCs w:val="28"/>
+          <w:lang w:val="el-GR"/>
+        </w:rPr>
+        <w:t>.1</w:t>
+      </w:r>
+      <w:r>
+        <w:rPr>
+          <w:sz w:val="28"/>
+          <w:szCs w:val="28"/>
+          <w:lang w:val="el-GR"/>
+        </w:rPr>
+        <w:t>.</w:t>
+      </w:r>
+      <w:r>
+        <w:rPr>
+          <w:sz w:val="28"/>
+          <w:szCs w:val="28"/>
+          <w:lang w:val="el-GR"/>
+        </w:rPr>
+        <w:t xml:space="preserve"> </w:t>
+      </w:r>
+      <w:r>
+        <w:rPr>
+          <w:sz w:val="28"/>
+          <w:szCs w:val="28"/>
+          <w:lang w:val="el-GR"/>
+        </w:rPr>
+        <w:t xml:space="preserve">Το σύστημα επιστρέφει </w:t>
+      </w:r>
+      <w:r>
+        <w:rPr>
+          <w:strike/>
+          <w:sz w:val="28"/>
+          <w:szCs w:val="28"/>
+          <w:lang w:val="el-GR"/>
+        </w:rPr>
+        <w:t>“</w:t>
+      </w:r>
+      <w:r>
+        <w:rPr>
+          <w:strike/>
+          <w:sz w:val="28"/>
+          <w:szCs w:val="28"/>
+        </w:rPr>
+        <w:t>No</w:t>
+      </w:r>
+      <w:r>
+        <w:rPr>
+          <w:strike/>
+          <w:sz w:val="28"/>
+          <w:szCs w:val="28"/>
+          <w:lang w:val="el-GR"/>
+        </w:rPr>
+        <w:t xml:space="preserve"> </w:t>
+      </w:r>
+      <w:r>
+        <w:rPr>
+          <w:strike/>
+          <w:sz w:val="28"/>
+          <w:szCs w:val="28"/>
+        </w:rPr>
+        <w:t>results</w:t>
+      </w:r>
+      <w:r>
+        <w:rPr>
+          <w:strike/>
+          <w:sz w:val="28"/>
+          <w:szCs w:val="28"/>
+          <w:lang w:val="el-GR"/>
+        </w:rPr>
+        <w:t xml:space="preserve"> </w:t>
+      </w:r>
+      <w:r>
+        <w:rPr>
+          <w:strike/>
+          <w:sz w:val="28"/>
+          <w:szCs w:val="28"/>
+        </w:rPr>
+        <w:t>found</w:t>
+      </w:r>
+      <w:r>
+        <w:rPr>
+          <w:strike/>
+          <w:sz w:val="28"/>
+          <w:szCs w:val="28"/>
+          <w:lang w:val="el-GR"/>
+        </w:rPr>
+        <w:t>”</w:t>
+      </w:r>
+      <w:r>
+        <w:rPr>
+          <w:sz w:val="28"/>
+          <w:szCs w:val="28"/>
+          <w:lang w:val="el-GR"/>
+        </w:rPr>
+        <w:t xml:space="preserve"> </w:t>
+      </w:r>
+      <w:r>
+        <w:rPr>
+          <w:sz w:val="28"/>
+          <w:szCs w:val="28"/>
+          <w:highlight w:val="red"/>
+          <w:lang w:val="el-GR"/>
+        </w:rPr>
+        <w:t>“</w:t>
+      </w:r>
+      <w:r>
+        <w:rPr>
+          <w:sz w:val="28"/>
+          <w:szCs w:val="28"/>
+          <w:highlight w:val="red"/>
+        </w:rPr>
+        <w:t>No</w:t>
+      </w:r>
+      <w:r>
+        <w:rPr>
+          <w:sz w:val="28"/>
+          <w:szCs w:val="28"/>
+          <w:highlight w:val="red"/>
+          <w:lang w:val="el-GR"/>
+        </w:rPr>
+        <w:t xml:space="preserve"> </w:t>
+      </w:r>
+      <w:r>
+        <w:rPr>
+          <w:sz w:val="28"/>
+          <w:szCs w:val="28"/>
+          <w:highlight w:val="red"/>
+        </w:rPr>
+        <w:t>available</w:t>
+      </w:r>
+      <w:r>
+        <w:rPr>
+          <w:sz w:val="28"/>
+          <w:szCs w:val="28"/>
+          <w:highlight w:val="red"/>
+          <w:lang w:val="el-GR"/>
+        </w:rPr>
+        <w:t xml:space="preserve"> </w:t>
+      </w:r>
+      <w:r>
+        <w:rPr>
+          <w:sz w:val="28"/>
+          <w:szCs w:val="28"/>
+          <w:highlight w:val="red"/>
+        </w:rPr>
+        <w:t>properties</w:t>
+      </w:r>
+      <w:r>
+        <w:rPr>
+          <w:sz w:val="28"/>
+          <w:szCs w:val="28"/>
+          <w:highlight w:val="red"/>
+          <w:lang w:val="el-GR"/>
+        </w:rPr>
+        <w:t xml:space="preserve"> </w:t>
+      </w:r>
+      <w:r>
+        <w:rPr>
+          <w:sz w:val="28"/>
+          <w:szCs w:val="28"/>
+          <w:highlight w:val="red"/>
+        </w:rPr>
+        <w:t>match</w:t>
+      </w:r>
+      <w:r>
+        <w:rPr>
+          <w:sz w:val="28"/>
+          <w:szCs w:val="28"/>
+          <w:highlight w:val="red"/>
+          <w:lang w:val="el-GR"/>
+        </w:rPr>
+        <w:t xml:space="preserve"> </w:t>
+      </w:r>
+      <w:r>
+        <w:rPr>
+          <w:sz w:val="28"/>
+          <w:szCs w:val="28"/>
+          <w:highlight w:val="red"/>
+        </w:rPr>
+        <w:t>your</w:t>
+      </w:r>
+      <w:r>
+        <w:rPr>
+          <w:sz w:val="28"/>
+          <w:szCs w:val="28"/>
+          <w:highlight w:val="red"/>
+          <w:lang w:val="el-GR"/>
+        </w:rPr>
+        <w:t xml:space="preserve"> </w:t>
+      </w:r>
+      <w:r>
+        <w:rPr>
+          <w:sz w:val="28"/>
+          <w:szCs w:val="28"/>
+          <w:highlight w:val="red"/>
+        </w:rPr>
+        <w:t>filters</w:t>
+      </w:r>
+      <w:r>
+        <w:rPr>
+          <w:sz w:val="28"/>
+          <w:szCs w:val="28"/>
+          <w:highlight w:val="red"/>
+          <w:lang w:val="el-GR"/>
+        </w:rPr>
+        <w:t>”</w:t>
+      </w:r>
+      <w:r>
+        <w:rPr>
+          <w:sz w:val="28"/>
+          <w:szCs w:val="28"/>
+          <w:lang w:val="el-GR"/>
+        </w:rPr>
+        <w:t xml:space="preserve">σε περίπτωση που δεν υπάρχουν αγγελίες </w:t>
+      </w:r>
+      <w:r>
+        <w:rPr>
+          <w:sz w:val="28"/>
+          <w:szCs w:val="28"/>
+          <w:lang w:val="el-GR"/>
+        </w:rPr>
+        <w:t>που</w:t>
+      </w:r>
+      <w:r>
+        <w:rPr>
+          <w:sz w:val="28"/>
+          <w:szCs w:val="28"/>
+          <w:lang w:val="el-GR"/>
+        </w:rPr>
+        <w:t xml:space="preserve"> να</w:t>
+      </w:r>
+      <w:r>
+        <w:rPr>
+          <w:sz w:val="28"/>
+          <w:szCs w:val="28"/>
+          <w:lang w:val="el-GR"/>
+        </w:rPr>
+        <w:t xml:space="preserve"> ταιριάζουν στα κριτήρια</w:t>
+      </w:r>
+      <w:r>
+        <w:rPr>
+          <w:sz w:val="28"/>
+          <w:szCs w:val="28"/>
+          <w:lang w:val="el-GR"/>
+        </w:rPr>
+        <w:t xml:space="preserve"> του χρήστη.</w:t>
+      </w:r>
+    </w:p>
+    <w:p>
+      <w:pPr>
+        <w:rPr>
+          <w:sz w:val="28"/>
+          <w:szCs w:val="28"/>
+          <w:lang w:val="el-GR"/>
+        </w:rPr>
+      </w:pPr>
+      <w:r>
+        <w:rPr>
+          <w:sz w:val="28"/>
+          <w:szCs w:val="28"/>
+          <w:lang w:val="el-GR"/>
+        </w:rPr>
+        <w:t>4</w:t>
+      </w:r>
+      <w:r>
+        <w:rPr>
+          <w:sz w:val="28"/>
+          <w:szCs w:val="28"/>
+          <w:lang w:val="el-GR"/>
+        </w:rPr>
+        <w:t xml:space="preserve">.α.2. </w:t>
+      </w:r>
+      <w:r>
+        <w:rPr>
+          <w:sz w:val="28"/>
+          <w:szCs w:val="28"/>
+          <w:lang w:val="el-GR"/>
+        </w:rPr>
+        <w:t xml:space="preserve">Η περίπτωση χρήσης επιστρέφει στο βήμα </w:t>
+      </w:r>
+      <w:r>
+        <w:rPr>
+          <w:sz w:val="28"/>
+          <w:szCs w:val="28"/>
+          <w:lang w:val="el-GR"/>
+        </w:rPr>
+        <w:t>3</w:t>
+      </w:r>
+      <w:r>
+        <w:rPr>
+          <w:sz w:val="28"/>
+          <w:szCs w:val="28"/>
+          <w:lang w:val="el-GR"/>
+        </w:rPr>
+        <w:t xml:space="preserve"> </w:t>
+      </w:r>
+      <w:r>
+        <w:rPr>
+          <w:sz w:val="28"/>
+          <w:szCs w:val="28"/>
+          <w:lang w:val="el-GR"/>
+        </w:rPr>
+        <w:t>της βασικής ροής.</w:t>
+      </w:r>
+    </w:p>
+    <w:p>
+      <w:pPr>
+        <w:rPr>
+          <w:sz w:val="28"/>
+          <w:szCs w:val="28"/>
           <w:u w:val="single"/>
           <w:lang w:val="el-GR"/>
         </w:rPr>
@@ -1819,6 +2245,7 @@
     <w:p>
       <w:pPr>
         <w:rPr>
+          <w:strike/>
           <w:sz w:val="28"/>
           <w:szCs w:val="28"/>
           <w:lang w:val="el-GR"/>
@@ -1949,7 +2376,23 @@
           <w:szCs w:val="28"/>
           <w:lang w:val="el-GR"/>
         </w:rPr>
-        <w:t xml:space="preserve">, </w:t>
+        <w:t xml:space="preserve"> </w:t>
+      </w:r>
+      <w:r>
+        <w:rPr>
+          <w:sz w:val="28"/>
+          <w:szCs w:val="28"/>
+          <w:lang w:val="el-GR"/>
+        </w:rPr>
+        <w:t>και</w:t>
+      </w:r>
+      <w:r>
+        <w:rPr>
+          <w:sz w:val="28"/>
+          <w:szCs w:val="28"/>
+          <w:lang w:val="el-GR"/>
+        </w:rPr>
+        <w:t xml:space="preserve"> </w:t>
       </w:r>
       <w:r>
         <w:rPr>
@@ -1975,36 +2418,52 @@
           <w:szCs w:val="28"/>
           <w:lang w:val="el-GR"/>
         </w:rPr>
-        <w:t>,</w:t>
-      </w:r>
-      <w:r>
-        <w:rPr>
-          <w:sz w:val="28"/>
-          <w:szCs w:val="28"/>
-          <w:lang w:val="el-GR"/>
-        </w:rPr>
-        <w:t xml:space="preserve"> προτρέποντας</w:t>
-      </w:r>
-      <w:r>
-        <w:rPr>
-          <w:sz w:val="28"/>
-          <w:szCs w:val="28"/>
+        <w:t>.</w:t>
+      </w:r>
+      <w:r>
+        <w:rPr>
+          <w:sz w:val="28"/>
+          <w:szCs w:val="28"/>
+          <w:lang w:val="el-GR"/>
+        </w:rPr>
+        <w:t xml:space="preserve"> </w:t>
+      </w:r>
+      <w:r>
+        <w:rPr>
+          <w:strike/>
+          <w:sz w:val="28"/>
+          <w:szCs w:val="28"/>
+          <w:highlight w:val="red"/>
+          <w:lang w:val="el-GR"/>
+        </w:rPr>
+        <w:t>προτρέποντας</w:t>
+      </w:r>
+      <w:r>
+        <w:rPr>
+          <w:strike/>
+          <w:sz w:val="28"/>
+          <w:szCs w:val="28"/>
+          <w:highlight w:val="red"/>
           <w:lang w:val="el-GR"/>
         </w:rPr>
         <w:t xml:space="preserve"> έτσι</w:t>
       </w:r>
       <w:r>
         <w:rPr>
-          <w:sz w:val="28"/>
-          <w:szCs w:val="28"/>
+          <w:strike/>
+          <w:sz w:val="28"/>
+          <w:szCs w:val="28"/>
+          <w:highlight w:val="red"/>
           <w:lang w:val="el-GR"/>
         </w:rPr>
         <w:t xml:space="preserve"> τον έλεγχο ορθότητάς τους</w:t>
       </w:r>
       <w:r>
         <w:rPr>
-          <w:sz w:val="28"/>
-          <w:szCs w:val="28"/>
+          <w:strike/>
+          <w:sz w:val="28"/>
+          <w:szCs w:val="28"/>
+          <w:highlight w:val="red"/>
           <w:lang w:val="el-GR"/>
         </w:rPr>
         <w:t>.</w:t>
@@ -2322,6 +2781,7 @@
           <w:szCs w:val="28"/>
           <w:lang w:val="el-GR"/>
         </w:rPr>
+        <w:lastRenderedPageBreak/>
         <w:t>2.</w:t>
       </w:r>
       <w:r>
@@ -2447,29 +2907,24 @@
         <w:rPr>
           <w:sz w:val="28"/>
           <w:szCs w:val="28"/>
-          <w:lang w:val="el-GR"/>
-        </w:rPr>
-      </w:pPr>
-      <w:r>
-        <w:rPr>
-          <w:sz w:val="28"/>
-          <w:szCs w:val="28"/>
-          <w:lang w:val="el-GR"/>
-        </w:rPr>
-        <w:t>2.</w:t>
-      </w:r>
-      <w:r>
-        <w:rPr>
-          <w:sz w:val="28"/>
-          <w:szCs w:val="28"/>
-          <w:lang w:val="el-GR"/>
-        </w:rPr>
-        <w:t>β.</w:t>
-      </w:r>
-      <w:r>
-        <w:rPr>
-          <w:sz w:val="28"/>
-          <w:szCs w:val="28"/>
+          <w:highlight w:val="red"/>
+          <w:lang w:val="el-GR"/>
+        </w:rPr>
+      </w:pPr>
+      <w:r>
+        <w:rPr>
+          <w:sz w:val="28"/>
+          <w:szCs w:val="28"/>
+          <w:highlight w:val="red"/>
+          <w:lang w:val="el-GR"/>
+        </w:rPr>
+        <w:t>2.β.</w:t>
+      </w:r>
+      <w:r>
+        <w:rPr>
+          <w:sz w:val="28"/>
+          <w:szCs w:val="28"/>
+          <w:highlight w:val="red"/>
           <w:lang w:val="el-GR"/>
         </w:rPr>
         <w:t>2</w:t>
@@ -2478,17 +2933,10 @@
         <w:rPr>
           <w:sz w:val="28"/>
           <w:szCs w:val="28"/>
-          <w:lang w:val="el-GR"/>
-        </w:rPr>
-        <w:t xml:space="preserve">. </w:t>
-      </w:r>
-      <w:r>
-        <w:rPr>
-          <w:sz w:val="28"/>
-          <w:szCs w:val="28"/>
-          <w:lang w:val="el-GR"/>
-        </w:rPr>
-        <w:t xml:space="preserve">Το σύστημα εγγράφει τα στοιχεία του χρήστη δημιουργώντας του λογαριασμό στην εφαρμογή. </w:t>
+          <w:highlight w:val="red"/>
+          <w:lang w:val="el-GR"/>
+        </w:rPr>
+        <w:t>. Το σύστημα μεταφέρει τον χρήστη στο αντίστοιχο παράθυρο.</w:t>
       </w:r>
     </w:p>
     <w:p>
@@ -2503,6 +2951,7 @@
         <w:rPr>
           <w:sz w:val="28"/>
           <w:szCs w:val="28"/>
+          <w:highlight w:val="red"/>
           <w:lang w:val="el-GR"/>
         </w:rPr>
         <w:t>2.β.</w:t>
@@ -2511,6 +2960,7 @@
         <w:rPr>
           <w:sz w:val="28"/>
           <w:szCs w:val="28"/>
+          <w:highlight w:val="red"/>
           <w:lang w:val="el-GR"/>
         </w:rPr>
         <w:t>3</w:t>
@@ -2519,41 +2969,44 @@
         <w:rPr>
           <w:sz w:val="28"/>
           <w:szCs w:val="28"/>
-          <w:lang w:val="el-GR"/>
-        </w:rPr>
-        <w:t>.</w:t>
-      </w:r>
-      <w:r>
-        <w:rPr>
-          <w:sz w:val="28"/>
-          <w:szCs w:val="28"/>
-          <w:lang w:val="el-GR"/>
-        </w:rPr>
-        <w:t xml:space="preserve"> Η περίπτωση χρήσης επιστρέφει στο βήμα </w:t>
-      </w:r>
-      <w:r>
-        <w:rPr>
-          <w:sz w:val="28"/>
-          <w:szCs w:val="28"/>
-          <w:lang w:val="el-GR"/>
-        </w:rPr>
-        <w:t>1</w:t>
-      </w:r>
-      <w:r>
-        <w:rPr>
-          <w:sz w:val="28"/>
-          <w:szCs w:val="28"/>
-          <w:lang w:val="el-GR"/>
-        </w:rPr>
-        <w:t xml:space="preserve"> της βασικής ροής.</w:t>
-      </w:r>
-      <w:r>
-        <w:rPr>
-          <w:sz w:val="28"/>
-          <w:szCs w:val="28"/>
-          <w:lang w:val="el-GR"/>
-        </w:rPr>
-        <w:t xml:space="preserve"> </w:t>
+          <w:highlight w:val="red"/>
+          <w:lang w:val="el-GR"/>
+        </w:rPr>
+        <w:t>. Ο χρήστης εισάγει τα στοιχεία του και επιλέγει “</w:t>
+      </w:r>
+      <w:r>
+        <w:rPr>
+          <w:sz w:val="28"/>
+          <w:szCs w:val="28"/>
+          <w:highlight w:val="red"/>
+        </w:rPr>
+        <w:t>Create</w:t>
+      </w:r>
+      <w:r>
+        <w:rPr>
+          <w:sz w:val="28"/>
+          <w:szCs w:val="28"/>
+          <w:highlight w:val="red"/>
+          <w:lang w:val="el-GR"/>
+        </w:rPr>
+        <w:t xml:space="preserve"> </w:t>
+      </w:r>
+      <w:r>
+        <w:rPr>
+          <w:sz w:val="28"/>
+          <w:szCs w:val="28"/>
+          <w:highlight w:val="red"/>
+        </w:rPr>
+        <w:t>Account</w:t>
+      </w:r>
+      <w:r>
+        <w:rPr>
+          <w:sz w:val="28"/>
+          <w:szCs w:val="28"/>
+          <w:highlight w:val="red"/>
+          <w:lang w:val="el-GR"/>
+        </w:rPr>
+        <w:t>”.</w:t>
       </w:r>
     </w:p>
     <w:p>
@@ -2564,43 +3017,110 @@
           <w:lang w:val="el-GR"/>
         </w:rPr>
       </w:pPr>
+      <w:r>
+        <w:rPr>
+          <w:sz w:val="28"/>
+          <w:szCs w:val="28"/>
+          <w:lang w:val="el-GR"/>
+        </w:rPr>
+        <w:t>2.</w:t>
+      </w:r>
+      <w:r>
+        <w:rPr>
+          <w:sz w:val="28"/>
+          <w:szCs w:val="28"/>
+          <w:lang w:val="el-GR"/>
+        </w:rPr>
+        <w:t>β.</w:t>
+      </w:r>
+      <w:r>
+        <w:rPr>
+          <w:sz w:val="28"/>
+          <w:szCs w:val="28"/>
+          <w:lang w:val="el-GR"/>
+        </w:rPr>
+        <w:t>4</w:t>
+      </w:r>
+      <w:r>
+        <w:rPr>
+          <w:sz w:val="28"/>
+          <w:szCs w:val="28"/>
+          <w:lang w:val="el-GR"/>
+        </w:rPr>
+        <w:t xml:space="preserve">. </w:t>
+      </w:r>
+      <w:r>
+        <w:rPr>
+          <w:sz w:val="28"/>
+          <w:szCs w:val="28"/>
+          <w:lang w:val="el-GR"/>
+        </w:rPr>
+        <w:t xml:space="preserve">Το σύστημα εγγράφει τα στοιχεία του χρήστη δημιουργώντας του λογαριασμό στην εφαρμογή. </w:t>
+      </w:r>
     </w:p>
     <w:p>
       <w:pPr>
         <w:rPr>
           <w:sz w:val="28"/>
           <w:szCs w:val="28"/>
-          <w:u w:val="single"/>
-          <w:lang w:val="el-GR"/>
-        </w:rPr>
-      </w:pPr>
-      <w:r>
-        <w:rPr>
-          <w:sz w:val="28"/>
-          <w:szCs w:val="28"/>
-          <w:u w:val="single"/>
-          <w:lang w:val="el-GR"/>
-        </w:rPr>
-        <w:lastRenderedPageBreak/>
-        <w:t xml:space="preserve">Εναλλακτική Ροή </w:t>
-      </w:r>
-      <w:r>
-        <w:rPr>
-          <w:sz w:val="28"/>
-          <w:szCs w:val="28"/>
-          <w:u w:val="single"/>
-          <w:lang w:val="el-GR"/>
-        </w:rPr>
-        <w:t>3</w:t>
-      </w:r>
-      <w:r>
-        <w:rPr>
-          <w:sz w:val="28"/>
-          <w:szCs w:val="28"/>
-          <w:u w:val="single"/>
-          <w:lang w:val="el-GR"/>
-        </w:rPr>
-        <w:t>:</w:t>
+          <w:lang w:val="el-GR"/>
+        </w:rPr>
+      </w:pPr>
+      <w:r>
+        <w:rPr>
+          <w:sz w:val="28"/>
+          <w:szCs w:val="28"/>
+          <w:lang w:val="el-GR"/>
+        </w:rPr>
+        <w:t>2.β.</w:t>
+      </w:r>
+      <w:r>
+        <w:rPr>
+          <w:sz w:val="28"/>
+          <w:szCs w:val="28"/>
+          <w:lang w:val="el-GR"/>
+        </w:rPr>
+        <w:t>5</w:t>
+      </w:r>
+      <w:r>
+        <w:rPr>
+          <w:sz w:val="28"/>
+          <w:szCs w:val="28"/>
+          <w:lang w:val="el-GR"/>
+        </w:rPr>
+        <w:t>.</w:t>
+      </w:r>
+      <w:r>
+        <w:rPr>
+          <w:sz w:val="28"/>
+          <w:szCs w:val="28"/>
+          <w:lang w:val="el-GR"/>
+        </w:rPr>
+        <w:t xml:space="preserve"> Η περίπτωση χρήσης επιστρέφει στο βήμα </w:t>
+      </w:r>
+      <w:r>
+        <w:rPr>
+          <w:sz w:val="28"/>
+          <w:szCs w:val="28"/>
+          <w:lang w:val="el-GR"/>
+        </w:rPr>
+        <w:t>1</w:t>
+      </w:r>
+      <w:r>
+        <w:rPr>
+          <w:sz w:val="28"/>
+          <w:szCs w:val="28"/>
+          <w:lang w:val="el-GR"/>
+        </w:rPr>
+        <w:t xml:space="preserve"> της βασικής ροής.</w:t>
+      </w:r>
+      <w:r>
+        <w:rPr>
+          <w:sz w:val="28"/>
+          <w:szCs w:val="28"/>
+          <w:lang w:val="el-GR"/>
+        </w:rPr>
+        <w:t xml:space="preserve"> </w:t>
       </w:r>
     </w:p>
     <w:p>
@@ -2608,72 +3128,333 @@
         <w:rPr>
           <w:sz w:val="28"/>
           <w:szCs w:val="28"/>
-          <w:lang w:val="el-GR"/>
-        </w:rPr>
-      </w:pPr>
-      <w:r>
-        <w:rPr>
-          <w:sz w:val="28"/>
-          <w:szCs w:val="28"/>
-          <w:lang w:val="el-GR"/>
-        </w:rPr>
-        <w:t xml:space="preserve">9.α.1. Ο χρήστης επιλέγει να απορρίψει την αίτηση επιλέγοντας το </w:t>
-      </w:r>
-      <w:r>
-        <w:rPr>
-          <w:sz w:val="28"/>
-          <w:szCs w:val="28"/>
-          <w:lang w:val="el-GR"/>
-        </w:rPr>
-        <w:t>“</w:t>
-      </w:r>
-      <w:r>
-        <w:rPr>
-          <w:sz w:val="28"/>
-          <w:szCs w:val="28"/>
-        </w:rPr>
-        <w:t>decline</w:t>
-      </w:r>
-      <w:r>
-        <w:rPr>
-          <w:sz w:val="28"/>
-          <w:szCs w:val="28"/>
-          <w:lang w:val="el-GR"/>
-        </w:rPr>
-        <w:t>”</w:t>
-      </w:r>
-      <w:r>
-        <w:rPr>
-          <w:sz w:val="28"/>
-          <w:szCs w:val="28"/>
-          <w:lang w:val="el-GR"/>
-        </w:rPr>
-        <w:t>.</w:t>
+          <w:highlight w:val="red"/>
+          <w:u w:val="single"/>
+          <w:lang w:val="el-GR"/>
+        </w:rPr>
+      </w:pPr>
+      <w:r>
+        <w:rPr>
+          <w:sz w:val="28"/>
+          <w:szCs w:val="28"/>
+          <w:highlight w:val="red"/>
+          <w:u w:val="single"/>
+          <w:lang w:val="el-GR"/>
+        </w:rPr>
+        <w:t xml:space="preserve">Εναλλακτική Ροή </w:t>
+      </w:r>
+      <w:r>
+        <w:rPr>
+          <w:sz w:val="28"/>
+          <w:szCs w:val="28"/>
+          <w:highlight w:val="red"/>
+          <w:u w:val="single"/>
+          <w:lang w:val="el-GR"/>
+        </w:rPr>
+        <w:t>3</w:t>
+      </w:r>
+      <w:r>
+        <w:rPr>
+          <w:sz w:val="28"/>
+          <w:szCs w:val="28"/>
+          <w:highlight w:val="red"/>
+          <w:u w:val="single"/>
+          <w:lang w:val="el-GR"/>
+        </w:rPr>
+        <w:t>:</w:t>
       </w:r>
     </w:p>
     <w:p>
       <w:pPr>
         <w:rPr>
-          <w:sz w:val="28"/>
-          <w:szCs w:val="28"/>
-          <w:lang w:val="el-GR"/>
-        </w:rPr>
-      </w:pPr>
-      <w:r>
-        <w:rPr>
-          <w:sz w:val="28"/>
-          <w:szCs w:val="28"/>
-          <w:lang w:val="el-GR"/>
-        </w:rPr>
-        <w:t xml:space="preserve">9.α.2. Το σύστημα δεν </w:t>
-      </w:r>
-      <w:r>
-        <w:rPr>
-          <w:sz w:val="28"/>
-          <w:szCs w:val="28"/>
-          <w:lang w:val="el-GR"/>
-        </w:rPr>
-        <w:t>καταχωρεί καμία πληροφορία σχετικά με την αγγελία.</w:t>
+          <w:sz w:val="32"/>
+          <w:szCs w:val="32"/>
+          <w:highlight w:val="red"/>
+          <w:lang w:val="el-GR"/>
+        </w:rPr>
+      </w:pPr>
+      <w:r>
+        <w:rPr>
+          <w:sz w:val="28"/>
+          <w:szCs w:val="28"/>
+          <w:highlight w:val="red"/>
+          <w:lang w:val="el-GR"/>
+        </w:rPr>
+        <w:t>(</w:t>
+      </w:r>
+      <w:r>
+        <w:rPr>
+          <w:sz w:val="28"/>
+          <w:szCs w:val="28"/>
+          <w:highlight w:val="red"/>
+          <w:lang w:val="el-GR"/>
+        </w:rPr>
+        <w:t>2.β.3</w:t>
+      </w:r>
+      <w:r>
+        <w:rPr>
+          <w:sz w:val="28"/>
+          <w:szCs w:val="28"/>
+          <w:highlight w:val="red"/>
+          <w:lang w:val="el-GR"/>
+        </w:rPr>
+        <w:t xml:space="preserve">).α.1. Το σύστημα διακρίνει ότι το </w:t>
+      </w:r>
+      <w:r>
+        <w:rPr>
+          <w:sz w:val="28"/>
+          <w:szCs w:val="28"/>
+          <w:highlight w:val="red"/>
+        </w:rPr>
+        <w:t>user</w:t>
+      </w:r>
+      <w:r>
+        <w:rPr>
+          <w:sz w:val="28"/>
+          <w:szCs w:val="28"/>
+          <w:highlight w:val="red"/>
+          <w:lang w:val="el-GR"/>
+        </w:rPr>
+        <w:t xml:space="preserve"> </w:t>
+      </w:r>
+      <w:r>
+        <w:rPr>
+          <w:sz w:val="28"/>
+          <w:szCs w:val="28"/>
+          <w:highlight w:val="red"/>
+        </w:rPr>
+        <w:t>email</w:t>
+      </w:r>
+      <w:r>
+        <w:rPr>
+          <w:sz w:val="28"/>
+          <w:szCs w:val="28"/>
+          <w:highlight w:val="red"/>
+          <w:lang w:val="el-GR"/>
+        </w:rPr>
+        <w:t xml:space="preserve"> δεν ακολουθεί το πρότυπο </w:t>
+      </w:r>
+      <w:r>
+        <w:rPr>
+          <w:color w:val="000000" w:themeColor="text1"/>
+          <w:sz w:val="28"/>
+          <w:szCs w:val="28"/>
+          <w:highlight w:val="red"/>
+        </w:rPr>
+        <w:t>regex</w:t>
+      </w:r>
+      <w:r>
+        <w:rPr>
+          <w:color w:val="000000" w:themeColor="text1"/>
+          <w:sz w:val="28"/>
+          <w:szCs w:val="28"/>
+          <w:highlight w:val="red"/>
+          <w:lang w:val="el-GR"/>
+        </w:rPr>
+        <w:t xml:space="preserve"> "^[</w:t>
+      </w:r>
+      <w:r>
+        <w:rPr>
+          <w:color w:val="000000" w:themeColor="text1"/>
+          <w:sz w:val="28"/>
+          <w:szCs w:val="28"/>
+          <w:highlight w:val="red"/>
+        </w:rPr>
+        <w:t>A</w:t>
+      </w:r>
+      <w:r>
+        <w:rPr>
+          <w:color w:val="000000" w:themeColor="text1"/>
+          <w:sz w:val="28"/>
+          <w:szCs w:val="28"/>
+          <w:highlight w:val="red"/>
+          <w:lang w:val="el-GR"/>
+        </w:rPr>
+        <w:t>-</w:t>
+      </w:r>
+      <w:r>
+        <w:rPr>
+          <w:color w:val="000000" w:themeColor="text1"/>
+          <w:sz w:val="28"/>
+          <w:szCs w:val="28"/>
+          <w:highlight w:val="red"/>
+        </w:rPr>
+        <w:t>Za</w:t>
+      </w:r>
+      <w:r>
+        <w:rPr>
+          <w:color w:val="000000" w:themeColor="text1"/>
+          <w:sz w:val="28"/>
+          <w:szCs w:val="28"/>
+          <w:highlight w:val="red"/>
+          <w:lang w:val="el-GR"/>
+        </w:rPr>
+        <w:t>-</w:t>
+      </w:r>
+      <w:r>
+        <w:rPr>
+          <w:color w:val="000000" w:themeColor="text1"/>
+          <w:sz w:val="28"/>
+          <w:szCs w:val="28"/>
+          <w:highlight w:val="red"/>
+        </w:rPr>
+        <w:t>z</w:t>
+      </w:r>
+      <w:r>
+        <w:rPr>
+          <w:color w:val="000000" w:themeColor="text1"/>
+          <w:sz w:val="28"/>
+          <w:szCs w:val="28"/>
+          <w:highlight w:val="red"/>
+          <w:lang w:val="el-GR"/>
+        </w:rPr>
+        <w:t>0-9+_.-]</w:t>
+      </w:r>
+      <w:hyperlink r:id="rId5" w:history="1">
+        <w:r>
+          <w:rPr>
+            <w:rStyle w:val="Hyperlink"/>
+            <w:sz w:val="28"/>
+            <w:szCs w:val="28"/>
+            <w:highlight w:val="red"/>
+            <w:lang w:val="el-GR"/>
+          </w:rPr>
+          <w:t>+@[</w:t>
+        </w:r>
+        <w:r>
+          <w:rPr>
+            <w:rStyle w:val="Hyperlink"/>
+            <w:sz w:val="28"/>
+            <w:szCs w:val="28"/>
+            <w:highlight w:val="red"/>
+          </w:rPr>
+          <w:t>A</w:t>
+        </w:r>
+        <w:r>
+          <w:rPr>
+            <w:rStyle w:val="Hyperlink"/>
+            <w:sz w:val="28"/>
+            <w:szCs w:val="28"/>
+            <w:highlight w:val="red"/>
+            <w:lang w:val="el-GR"/>
+          </w:rPr>
+          <w:t>-</w:t>
+        </w:r>
+        <w:r>
+          <w:rPr>
+            <w:rStyle w:val="Hyperlink"/>
+            <w:sz w:val="28"/>
+            <w:szCs w:val="28"/>
+            <w:highlight w:val="red"/>
+          </w:rPr>
+          <w:t>Za</w:t>
+        </w:r>
+        <w:r>
+          <w:rPr>
+            <w:rStyle w:val="Hyperlink"/>
+            <w:sz w:val="28"/>
+            <w:szCs w:val="28"/>
+            <w:highlight w:val="red"/>
+            <w:lang w:val="el-GR"/>
+          </w:rPr>
+          <w:t>-</w:t>
+        </w:r>
+        <w:r>
+          <w:rPr>
+            <w:rStyle w:val="Hyperlink"/>
+            <w:sz w:val="28"/>
+            <w:szCs w:val="28"/>
+            <w:highlight w:val="red"/>
+          </w:rPr>
+          <w:t>z</w:t>
+        </w:r>
+        <w:r>
+          <w:rPr>
+            <w:rStyle w:val="Hyperlink"/>
+            <w:sz w:val="28"/>
+            <w:szCs w:val="28"/>
+            <w:highlight w:val="red"/>
+            <w:lang w:val="el-GR"/>
+          </w:rPr>
+          <w:t>0-9.-]+\\.[</w:t>
+        </w:r>
+        <w:r>
+          <w:rPr>
+            <w:rStyle w:val="Hyperlink"/>
+            <w:sz w:val="28"/>
+            <w:szCs w:val="28"/>
+            <w:highlight w:val="red"/>
+          </w:rPr>
+          <w:t>A</w:t>
+        </w:r>
+        <w:r>
+          <w:rPr>
+            <w:rStyle w:val="Hyperlink"/>
+            <w:sz w:val="28"/>
+            <w:szCs w:val="28"/>
+            <w:highlight w:val="red"/>
+            <w:lang w:val="el-GR"/>
+          </w:rPr>
+          <w:t>-</w:t>
+        </w:r>
+        <w:r>
+          <w:rPr>
+            <w:rStyle w:val="Hyperlink"/>
+            <w:sz w:val="28"/>
+            <w:szCs w:val="28"/>
+            <w:highlight w:val="red"/>
+          </w:rPr>
+          <w:t>Za</w:t>
+        </w:r>
+        <w:r>
+          <w:rPr>
+            <w:rStyle w:val="Hyperlink"/>
+            <w:sz w:val="28"/>
+            <w:szCs w:val="28"/>
+            <w:highlight w:val="red"/>
+            <w:lang w:val="el-GR"/>
+          </w:rPr>
+          <w:t>-</w:t>
+        </w:r>
+        <w:r>
+          <w:rPr>
+            <w:rStyle w:val="Hyperlink"/>
+            <w:sz w:val="28"/>
+            <w:szCs w:val="28"/>
+            <w:highlight w:val="red"/>
+          </w:rPr>
+          <w:t>z</w:t>
+        </w:r>
+        <w:r>
+          <w:rPr>
+            <w:rStyle w:val="Hyperlink"/>
+            <w:sz w:val="28"/>
+            <w:szCs w:val="28"/>
+            <w:highlight w:val="red"/>
+            <w:lang w:val="el-GR"/>
+          </w:rPr>
+          <w:t>]{2,}$</w:t>
+        </w:r>
+      </w:hyperlink>
+      <w:r>
+        <w:rPr>
+          <w:color w:val="000000" w:themeColor="text1"/>
+          <w:sz w:val="28"/>
+          <w:szCs w:val="28"/>
+          <w:highlight w:val="red"/>
+          <w:lang w:val="el-GR"/>
+        </w:rPr>
+        <w:t>"</w:t>
+      </w:r>
+      <w:r>
+        <w:rPr>
+          <w:color w:val="000000" w:themeColor="text1"/>
+          <w:sz w:val="28"/>
+          <w:szCs w:val="28"/>
+          <w:highlight w:val="red"/>
+          <w:lang w:val="el-GR"/>
+        </w:rPr>
+        <w:t xml:space="preserve"> .</w:t>
       </w:r>
     </w:p>
     <w:p>
@@ -2681,48 +3462,72 @@
         <w:rPr>
           <w:sz w:val="28"/>
           <w:szCs w:val="28"/>
-          <w:lang w:val="el-GR"/>
-        </w:rPr>
-      </w:pPr>
-      <w:r>
-        <w:rPr>
-          <w:sz w:val="28"/>
-          <w:szCs w:val="28"/>
-          <w:lang w:val="el-GR"/>
-        </w:rPr>
-        <w:t xml:space="preserve">9.α.3. </w:t>
-      </w:r>
-      <w:r>
-        <w:rPr>
-          <w:sz w:val="28"/>
-          <w:szCs w:val="28"/>
-          <w:lang w:val="el-GR"/>
-        </w:rPr>
-        <w:t xml:space="preserve">Η περίπτωση χρήσης επιστρέφει στο βήμα </w:t>
-      </w:r>
-      <w:r>
-        <w:rPr>
-          <w:sz w:val="28"/>
-          <w:szCs w:val="28"/>
-          <w:lang w:val="el-GR"/>
-        </w:rPr>
-        <w:t>4</w:t>
-      </w:r>
-      <w:r>
-        <w:rPr>
-          <w:sz w:val="28"/>
-          <w:szCs w:val="28"/>
-          <w:lang w:val="el-GR"/>
-        </w:rPr>
-        <w:t xml:space="preserve"> </w:t>
-      </w:r>
-      <w:r>
-        <w:rPr>
-          <w:sz w:val="28"/>
-          <w:szCs w:val="28"/>
-          <w:lang w:val="el-GR"/>
-        </w:rPr>
-        <w:t>της βασικής ροής.</w:t>
+          <w:highlight w:val="red"/>
+          <w:lang w:val="el-GR"/>
+        </w:rPr>
+      </w:pPr>
+      <w:r>
+        <w:rPr>
+          <w:sz w:val="28"/>
+          <w:szCs w:val="28"/>
+          <w:highlight w:val="red"/>
+          <w:lang w:val="el-GR"/>
+        </w:rPr>
+        <w:t>(2.β.3).α.</w:t>
+      </w:r>
+      <w:r>
+        <w:rPr>
+          <w:sz w:val="28"/>
+          <w:szCs w:val="28"/>
+          <w:highlight w:val="red"/>
+          <w:lang w:val="el-GR"/>
+        </w:rPr>
+        <w:t xml:space="preserve">2. </w:t>
+      </w:r>
+      <w:r>
+        <w:rPr>
+          <w:sz w:val="28"/>
+          <w:szCs w:val="28"/>
+          <w:highlight w:val="red"/>
+          <w:lang w:val="el-GR"/>
+        </w:rPr>
+        <w:t>Το σύστημα</w:t>
+      </w:r>
+      <w:r>
+        <w:rPr>
+          <w:sz w:val="28"/>
+          <w:szCs w:val="28"/>
+          <w:highlight w:val="red"/>
+          <w:lang w:val="el-GR"/>
+        </w:rPr>
+        <w:t xml:space="preserve"> εμφανίζει αντίστοιχο μήνυμα σφάλματος</w:t>
+      </w:r>
+      <w:r>
+        <w:rPr>
+          <w:sz w:val="28"/>
+          <w:szCs w:val="28"/>
+          <w:highlight w:val="red"/>
+          <w:lang w:val="el-GR"/>
+        </w:rPr>
+        <w:t xml:space="preserve"> και </w:t>
+      </w:r>
+      <w:r>
+        <w:rPr>
+          <w:sz w:val="28"/>
+          <w:szCs w:val="28"/>
+          <w:highlight w:val="red"/>
+          <w:lang w:val="el-GR"/>
+        </w:rPr>
+        <w:t>μεταφέρει</w:t>
+      </w:r>
+      <w:r>
+        <w:rPr>
+          <w:sz w:val="28"/>
+          <w:szCs w:val="28"/>
+          <w:highlight w:val="red"/>
+          <w:lang w:val="el-GR"/>
+        </w:rPr>
+        <w:t xml:space="preserve"> τον χρήστη στο παράθυρο εγγραφής.</w:t>
       </w:r>
     </w:p>
     <w:p>
@@ -2730,36 +3535,53 @@
         <w:rPr>
           <w:sz w:val="28"/>
           <w:szCs w:val="28"/>
-          <w:u w:val="single"/>
-          <w:lang w:val="el-GR"/>
-        </w:rPr>
-      </w:pPr>
-      <w:r>
-        <w:rPr>
-          <w:sz w:val="28"/>
-          <w:szCs w:val="28"/>
-          <w:u w:val="single"/>
-          <w:lang w:val="el-GR"/>
-        </w:rPr>
-        <w:t xml:space="preserve">Εναλλακτική Ροή </w:t>
-      </w:r>
-      <w:r>
-        <w:rPr>
-          <w:sz w:val="28"/>
-          <w:szCs w:val="28"/>
-          <w:u w:val="single"/>
-          <w:lang w:val="el-GR"/>
-        </w:rPr>
-        <w:t>4</w:t>
-      </w:r>
-      <w:r>
-        <w:rPr>
-          <w:sz w:val="28"/>
-          <w:szCs w:val="28"/>
-          <w:u w:val="single"/>
-          <w:lang w:val="el-GR"/>
-        </w:rPr>
-        <w:t>:</w:t>
+          <w:highlight w:val="red"/>
+          <w:lang w:val="el-GR"/>
+        </w:rPr>
+      </w:pPr>
+      <w:r>
+        <w:rPr>
+          <w:sz w:val="28"/>
+          <w:szCs w:val="28"/>
+          <w:highlight w:val="red"/>
+          <w:lang w:val="el-GR"/>
+        </w:rPr>
+        <w:t>(2.β.3).α.</w:t>
+      </w:r>
+      <w:r>
+        <w:rPr>
+          <w:sz w:val="28"/>
+          <w:szCs w:val="28"/>
+          <w:highlight w:val="red"/>
+          <w:lang w:val="el-GR"/>
+        </w:rPr>
+        <w:t xml:space="preserve">3. Ο χρήστης εισάγει στοιχεία χρήστη αλλά χρησιμοποιεί </w:t>
+      </w:r>
+      <w:r>
+        <w:rPr>
+          <w:sz w:val="28"/>
+          <w:szCs w:val="28"/>
+          <w:highlight w:val="red"/>
+        </w:rPr>
+        <w:t>email</w:t>
+      </w:r>
+      <w:r>
+        <w:rPr>
+          <w:sz w:val="28"/>
+          <w:szCs w:val="28"/>
+          <w:highlight w:val="red"/>
+          <w:lang w:val="el-GR"/>
+        </w:rPr>
+        <w:t xml:space="preserve"> </w:t>
+      </w:r>
+      <w:r>
+        <w:rPr>
+          <w:sz w:val="28"/>
+          <w:szCs w:val="28"/>
+          <w:highlight w:val="red"/>
+          <w:lang w:val="el-GR"/>
+        </w:rPr>
+        <w:t>υπάρχοντος χρήστη.</w:t>
       </w:r>
     </w:p>
     <w:p>
@@ -2767,54 +3589,27 @@
         <w:rPr>
           <w:sz w:val="28"/>
           <w:szCs w:val="28"/>
-          <w:lang w:val="el-GR"/>
-        </w:rPr>
-      </w:pPr>
-      <w:r>
-        <w:rPr>
-          <w:sz w:val="28"/>
-          <w:szCs w:val="28"/>
-          <w:lang w:val="el-GR"/>
-        </w:rPr>
-        <w:t xml:space="preserve">11.α.1. Ο χρήστης επιλέγει το κουμπί </w:t>
-      </w:r>
-      <w:r>
-        <w:rPr>
-          <w:sz w:val="28"/>
-          <w:szCs w:val="28"/>
-          <w:lang w:val="el-GR"/>
-        </w:rPr>
-        <w:t>“</w:t>
-      </w:r>
-      <w:r>
-        <w:rPr>
-          <w:sz w:val="28"/>
-          <w:szCs w:val="28"/>
-        </w:rPr>
-        <w:t>Cancel</w:t>
-      </w:r>
-      <w:r>
-        <w:rPr>
-          <w:sz w:val="28"/>
-          <w:szCs w:val="28"/>
-          <w:lang w:val="el-GR"/>
-        </w:rPr>
-        <w:t xml:space="preserve"> </w:t>
-      </w:r>
-      <w:r>
-        <w:rPr>
-          <w:sz w:val="28"/>
-          <w:szCs w:val="28"/>
-        </w:rPr>
-        <w:t>Application</w:t>
-      </w:r>
-      <w:r>
-        <w:rPr>
-          <w:sz w:val="28"/>
-          <w:szCs w:val="28"/>
-          <w:lang w:val="el-GR"/>
-        </w:rPr>
-        <w:t>”.</w:t>
+          <w:highlight w:val="red"/>
+          <w:lang w:val="el-GR"/>
+        </w:rPr>
+      </w:pPr>
+      <w:r>
+        <w:rPr>
+          <w:sz w:val="28"/>
+          <w:szCs w:val="28"/>
+          <w:highlight w:val="red"/>
+          <w:lang w:val="el-GR"/>
+        </w:rPr>
+        <w:t>(2.β.3).α.2. Το σύστημα εμφανίζει αντίστοιχο μήνυμα σφάλματος</w:t>
+      </w:r>
+      <w:r>
+        <w:rPr>
+          <w:sz w:val="28"/>
+          <w:szCs w:val="28"/>
+          <w:highlight w:val="red"/>
+          <w:lang w:val="el-GR"/>
+        </w:rPr>
+        <w:t xml:space="preserve"> και μεταφέρει τον χρήστη στο παράθυρο εγγραφής</w:t>
       </w:r>
     </w:p>
     <w:p>
@@ -2829,76 +3624,423 @@
         <w:rPr>
           <w:sz w:val="28"/>
           <w:szCs w:val="28"/>
-          <w:lang w:val="el-GR"/>
-        </w:rPr>
-        <w:t>11.α.</w:t>
-      </w:r>
-      <w:r>
-        <w:rPr>
-          <w:sz w:val="28"/>
-          <w:szCs w:val="28"/>
-          <w:lang w:val="el-GR"/>
-        </w:rPr>
-        <w:t xml:space="preserve">2. </w:t>
-      </w:r>
-      <w:r>
-        <w:rPr>
-          <w:sz w:val="28"/>
-          <w:szCs w:val="28"/>
-          <w:lang w:val="el-GR"/>
-        </w:rPr>
-        <w:t xml:space="preserve">Το σύστημα διαγράφει την </w:t>
-      </w:r>
-      <w:r>
-        <w:rPr>
-          <w:sz w:val="28"/>
-          <w:szCs w:val="28"/>
-          <w:lang w:val="el-GR"/>
-        </w:rPr>
-        <w:t xml:space="preserve">αίτηση </w:t>
-      </w:r>
-      <w:r>
-        <w:rPr>
-          <w:sz w:val="28"/>
-          <w:szCs w:val="28"/>
-          <w:lang w:val="el-GR"/>
-        </w:rPr>
-        <w:t>από την</w:t>
-      </w:r>
-      <w:r>
-        <w:rPr>
-          <w:sz w:val="28"/>
-          <w:szCs w:val="28"/>
-          <w:lang w:val="el-GR"/>
-        </w:rPr>
-        <w:t xml:space="preserve"> βάση δεδομένων</w:t>
-      </w:r>
-      <w:r>
-        <w:rPr>
-          <w:sz w:val="28"/>
-          <w:szCs w:val="28"/>
-          <w:lang w:val="el-GR"/>
-        </w:rPr>
-        <w:t xml:space="preserve">, </w:t>
-      </w:r>
-      <w:r>
-        <w:rPr>
-          <w:sz w:val="28"/>
-          <w:szCs w:val="28"/>
-          <w:lang w:val="el-GR"/>
-        </w:rPr>
-        <w:t xml:space="preserve">από το πεδίο </w:t>
-      </w:r>
-      <w:r>
-        <w:rPr>
-          <w:sz w:val="28"/>
-          <w:szCs w:val="28"/>
+          <w:highlight w:val="red"/>
+          <w:lang w:val="el-GR"/>
+        </w:rPr>
+        <w:t>(2.β.3).α.</w:t>
+      </w:r>
+      <w:r>
+        <w:rPr>
+          <w:sz w:val="28"/>
+          <w:szCs w:val="28"/>
+          <w:highlight w:val="red"/>
+          <w:lang w:val="el-GR"/>
+        </w:rPr>
+        <w:t>3</w:t>
+      </w:r>
+      <w:r>
+        <w:rPr>
+          <w:sz w:val="28"/>
+          <w:szCs w:val="28"/>
+          <w:highlight w:val="red"/>
+          <w:lang w:val="el-GR"/>
+        </w:rPr>
+        <w:t>.</w:t>
+      </w:r>
+      <w:r>
+        <w:rPr>
+          <w:sz w:val="28"/>
+          <w:szCs w:val="28"/>
+          <w:highlight w:val="red"/>
+          <w:lang w:val="el-GR"/>
+        </w:rPr>
+        <w:t xml:space="preserve"> Η περίπτωση χρήσης επιστρέφει στο βήμα </w:t>
+      </w:r>
+      <w:r>
+        <w:rPr>
+          <w:sz w:val="28"/>
+          <w:szCs w:val="28"/>
+          <w:highlight w:val="red"/>
+          <w:lang w:val="el-GR"/>
+        </w:rPr>
+        <w:t>2.β.</w:t>
+      </w:r>
+      <w:r>
+        <w:rPr>
+          <w:sz w:val="28"/>
+          <w:szCs w:val="28"/>
+          <w:highlight w:val="red"/>
+          <w:lang w:val="el-GR"/>
+        </w:rPr>
+        <w:t>3</w:t>
+      </w:r>
+      <w:r>
+        <w:rPr>
+          <w:sz w:val="28"/>
+          <w:szCs w:val="28"/>
+          <w:highlight w:val="red"/>
+          <w:lang w:val="el-GR"/>
+        </w:rPr>
+        <w:t>.</w:t>
+      </w:r>
+      <w:r>
+        <w:rPr>
+          <w:sz w:val="28"/>
+          <w:szCs w:val="28"/>
+          <w:highlight w:val="red"/>
+          <w:lang w:val="el-GR"/>
+        </w:rPr>
+        <w:t xml:space="preserve"> της εναλλακτικής ροής </w:t>
+      </w:r>
+      <w:r>
+        <w:rPr>
+          <w:color w:val="000000" w:themeColor="text1"/>
+          <w:sz w:val="28"/>
+          <w:szCs w:val="28"/>
+          <w:highlight w:val="red"/>
+          <w:u w:val="single"/>
+          <w:lang w:val="el-GR"/>
+        </w:rPr>
+        <w:t>2.1</w:t>
+      </w:r>
+      <w:r>
+        <w:rPr>
+          <w:color w:val="000000" w:themeColor="text1"/>
+          <w:sz w:val="28"/>
+          <w:szCs w:val="28"/>
+          <w:highlight w:val="red"/>
+          <w:u w:val="single"/>
+          <w:lang w:val="el-GR"/>
+        </w:rPr>
+        <w:t>.</w:t>
+      </w:r>
+    </w:p>
+    <w:p>
+      <w:pPr>
+        <w:rPr>
+          <w:sz w:val="28"/>
+          <w:szCs w:val="28"/>
+          <w:lang w:val="el-GR"/>
+        </w:rPr>
+      </w:pPr>
+    </w:p>
+    <w:p>
+      <w:pPr>
+        <w:rPr>
+          <w:sz w:val="28"/>
+          <w:szCs w:val="28"/>
+          <w:u w:val="single"/>
+          <w:lang w:val="el-GR"/>
+        </w:rPr>
+      </w:pPr>
+      <w:r>
+        <w:rPr>
+          <w:sz w:val="28"/>
+          <w:szCs w:val="28"/>
+          <w:u w:val="single"/>
+          <w:lang w:val="el-GR"/>
+        </w:rPr>
+        <w:t xml:space="preserve">Εναλλακτική Ροή </w:t>
+      </w:r>
+      <w:r>
+        <w:rPr>
+          <w:sz w:val="28"/>
+          <w:szCs w:val="28"/>
+          <w:u w:val="single"/>
+          <w:lang w:val="el-GR"/>
+        </w:rPr>
+        <w:t>4</w:t>
+      </w:r>
+      <w:r>
+        <w:rPr>
+          <w:sz w:val="28"/>
+          <w:szCs w:val="28"/>
+          <w:u w:val="single"/>
+          <w:lang w:val="el-GR"/>
+        </w:rPr>
+        <w:t>:</w:t>
+      </w:r>
+    </w:p>
+    <w:p>
+      <w:pPr>
+        <w:rPr>
+          <w:sz w:val="28"/>
+          <w:szCs w:val="28"/>
+          <w:lang w:val="el-GR"/>
+        </w:rPr>
+      </w:pPr>
+      <w:r>
+        <w:rPr>
+          <w:sz w:val="28"/>
+          <w:szCs w:val="28"/>
+          <w:lang w:val="el-GR"/>
+        </w:rPr>
+        <w:t xml:space="preserve">9.α.1. Ο χρήστης επιλέγει να απορρίψει την αίτηση επιλέγοντας </w:t>
+      </w:r>
+      <w:r>
+        <w:rPr>
+          <w:strike/>
+          <w:sz w:val="28"/>
+          <w:szCs w:val="28"/>
+          <w:highlight w:val="red"/>
           <w:lang w:val="el-GR"/>
         </w:rPr>
         <w:t>“</w:t>
       </w:r>
       <w:r>
         <w:rPr>
+          <w:strike/>
+          <w:sz w:val="28"/>
+          <w:szCs w:val="28"/>
+          <w:highlight w:val="red"/>
+        </w:rPr>
+        <w:t>decline</w:t>
+      </w:r>
+      <w:r>
+        <w:rPr>
+          <w:strike/>
+          <w:sz w:val="28"/>
+          <w:szCs w:val="28"/>
+          <w:highlight w:val="red"/>
+          <w:lang w:val="el-GR"/>
+        </w:rPr>
+        <w:t>”</w:t>
+      </w:r>
+      <w:r>
+        <w:rPr>
+          <w:strike/>
+          <w:sz w:val="28"/>
+          <w:szCs w:val="28"/>
+          <w:lang w:val="el-GR"/>
+        </w:rPr>
+        <w:t xml:space="preserve"> </w:t>
+      </w:r>
+      <w:r>
+        <w:rPr>
+          <w:sz w:val="28"/>
+          <w:szCs w:val="28"/>
+          <w:highlight w:val="red"/>
+          <w:lang w:val="el-GR"/>
+        </w:rPr>
+        <w:t>“</w:t>
+      </w:r>
+      <w:r>
+        <w:rPr>
+          <w:sz w:val="28"/>
+          <w:szCs w:val="28"/>
+          <w:highlight w:val="red"/>
+        </w:rPr>
+        <w:t>cancel</w:t>
+      </w:r>
+      <w:r>
+        <w:rPr>
+          <w:sz w:val="28"/>
+          <w:szCs w:val="28"/>
+          <w:highlight w:val="red"/>
+          <w:lang w:val="el-GR"/>
+        </w:rPr>
+        <w:t>”.</w:t>
+      </w:r>
+    </w:p>
+    <w:p>
+      <w:pPr>
+        <w:rPr>
+          <w:sz w:val="28"/>
+          <w:szCs w:val="28"/>
+          <w:lang w:val="el-GR"/>
+        </w:rPr>
+      </w:pPr>
+      <w:r>
+        <w:rPr>
+          <w:sz w:val="28"/>
+          <w:szCs w:val="28"/>
+          <w:lang w:val="el-GR"/>
+        </w:rPr>
+        <w:t xml:space="preserve">9.α.2. Το σύστημα δεν </w:t>
+      </w:r>
+      <w:r>
+        <w:rPr>
+          <w:sz w:val="28"/>
+          <w:szCs w:val="28"/>
+          <w:lang w:val="el-GR"/>
+        </w:rPr>
+        <w:t>καταχωρεί καμία πληροφορία σχετικά με την αγγελία.</w:t>
+      </w:r>
+    </w:p>
+    <w:p>
+      <w:pPr>
+        <w:rPr>
+          <w:sz w:val="28"/>
+          <w:szCs w:val="28"/>
+          <w:lang w:val="el-GR"/>
+        </w:rPr>
+      </w:pPr>
+      <w:r>
+        <w:rPr>
+          <w:sz w:val="28"/>
+          <w:szCs w:val="28"/>
+          <w:lang w:val="el-GR"/>
+        </w:rPr>
+        <w:t xml:space="preserve">9.α.3. </w:t>
+      </w:r>
+      <w:r>
+        <w:rPr>
+          <w:sz w:val="28"/>
+          <w:szCs w:val="28"/>
+          <w:lang w:val="el-GR"/>
+        </w:rPr>
+        <w:t xml:space="preserve">Η περίπτωση χρήσης επιστρέφει στο βήμα </w:t>
+      </w:r>
+      <w:r>
+        <w:rPr>
+          <w:sz w:val="28"/>
+          <w:szCs w:val="28"/>
+          <w:lang w:val="el-GR"/>
+        </w:rPr>
+        <w:t>4</w:t>
+      </w:r>
+      <w:r>
+        <w:rPr>
+          <w:sz w:val="28"/>
+          <w:szCs w:val="28"/>
+          <w:lang w:val="el-GR"/>
+        </w:rPr>
+        <w:t xml:space="preserve"> </w:t>
+      </w:r>
+      <w:r>
+        <w:rPr>
+          <w:sz w:val="28"/>
+          <w:szCs w:val="28"/>
+          <w:lang w:val="el-GR"/>
+        </w:rPr>
+        <w:t>της βασικής ροής.</w:t>
+      </w:r>
+    </w:p>
+    <w:p>
+      <w:pPr>
+        <w:rPr>
+          <w:strike/>
+          <w:sz w:val="28"/>
+          <w:szCs w:val="28"/>
+          <w:u w:val="single"/>
+          <w:lang w:val="el-GR"/>
+        </w:rPr>
+      </w:pPr>
+      <w:r>
+        <w:rPr>
+          <w:strike/>
+          <w:sz w:val="28"/>
+          <w:szCs w:val="28"/>
+          <w:u w:val="single"/>
+          <w:lang w:val="el-GR"/>
+        </w:rPr>
+        <w:t xml:space="preserve">Εναλλακτική Ροή </w:t>
+      </w:r>
+      <w:r>
+        <w:rPr>
+          <w:strike/>
+          <w:sz w:val="28"/>
+          <w:szCs w:val="28"/>
+          <w:u w:val="single"/>
+          <w:lang w:val="el-GR"/>
+        </w:rPr>
+        <w:t>4</w:t>
+      </w:r>
+      <w:r>
+        <w:rPr>
+          <w:strike/>
+          <w:sz w:val="28"/>
+          <w:szCs w:val="28"/>
+          <w:u w:val="single"/>
+          <w:lang w:val="el-GR"/>
+        </w:rPr>
+        <w:t>:</w:t>
+      </w:r>
+    </w:p>
+    <w:p>
+      <w:pPr>
+        <w:rPr>
+          <w:strike/>
+          <w:sz w:val="28"/>
+          <w:szCs w:val="28"/>
+          <w:lang w:val="el-GR"/>
+        </w:rPr>
+      </w:pPr>
+      <w:r>
+        <w:rPr>
+          <w:strike/>
+          <w:sz w:val="28"/>
+          <w:szCs w:val="28"/>
+          <w:lang w:val="el-GR"/>
+        </w:rPr>
+        <w:lastRenderedPageBreak/>
+        <w:t>11.α.1. Ο χρήστης επιλέγει το κουμπί “</w:t>
+      </w:r>
+      <w:r>
+        <w:rPr>
+          <w:strike/>
+          <w:sz w:val="28"/>
+          <w:szCs w:val="28"/>
+        </w:rPr>
+        <w:t>Cancel</w:t>
+      </w:r>
+      <w:r>
+        <w:rPr>
+          <w:strike/>
+          <w:sz w:val="28"/>
+          <w:szCs w:val="28"/>
+          <w:lang w:val="el-GR"/>
+        </w:rPr>
+        <w:t xml:space="preserve"> </w:t>
+      </w:r>
+      <w:r>
+        <w:rPr>
+          <w:strike/>
+          <w:sz w:val="28"/>
+          <w:szCs w:val="28"/>
+        </w:rPr>
+        <w:t>Application</w:t>
+      </w:r>
+      <w:r>
+        <w:rPr>
+          <w:strike/>
+          <w:sz w:val="28"/>
+          <w:szCs w:val="28"/>
+          <w:lang w:val="el-GR"/>
+        </w:rPr>
+        <w:t>”.</w:t>
+      </w:r>
+    </w:p>
+    <w:p>
+      <w:pPr>
+        <w:rPr>
+          <w:strike/>
+          <w:sz w:val="28"/>
+          <w:szCs w:val="28"/>
+          <w:lang w:val="el-GR"/>
+        </w:rPr>
+      </w:pPr>
+      <w:r>
+        <w:rPr>
+          <w:strike/>
+          <w:sz w:val="28"/>
+          <w:szCs w:val="28"/>
+          <w:lang w:val="el-GR"/>
+        </w:rPr>
+        <w:t>11.α.2. Το σύστημα διαγράφει την αίτηση από την βάση δεδομένων</w:t>
+      </w:r>
+      <w:r>
+        <w:rPr>
+          <w:strike/>
+          <w:sz w:val="28"/>
+          <w:szCs w:val="28"/>
+          <w:lang w:val="el-GR"/>
+        </w:rPr>
+        <w:t>, από το πεδίο “</w:t>
+      </w:r>
+      <w:r>
+        <w:rPr>
+          <w:strike/>
           <w:sz w:val="28"/>
           <w:szCs w:val="28"/>
           <w:lang w:val="el-GR"/>
@@ -2907,6 +4049,7 @@
       </w:r>
       <w:r>
         <w:rPr>
+          <w:strike/>
           <w:sz w:val="28"/>
           <w:szCs w:val="28"/>
         </w:rPr>
@@ -2914,14 +4057,16 @@
       </w:r>
       <w:r>
         <w:rPr>
-          <w:sz w:val="28"/>
-          <w:szCs w:val="28"/>
-          <w:lang w:val="el-GR"/>
-        </w:rPr>
-        <w:t xml:space="preserve"> </w:t>
-      </w:r>
-      <w:r>
-        <w:rPr>
+          <w:strike/>
+          <w:sz w:val="28"/>
+          <w:szCs w:val="28"/>
+          <w:lang w:val="el-GR"/>
+        </w:rPr>
+        <w:t xml:space="preserve"> </w:t>
+      </w:r>
+      <w:r>
+        <w:rPr>
+          <w:strike/>
           <w:sz w:val="28"/>
           <w:szCs w:val="28"/>
         </w:rPr>
@@ -2929,6 +4074,7 @@
       </w:r>
       <w:r>
         <w:rPr>
+          <w:strike/>
           <w:sz w:val="28"/>
           <w:szCs w:val="28"/>
         </w:rPr>
@@ -2936,22 +4082,16 @@
       </w:r>
       <w:r>
         <w:rPr>
-          <w:sz w:val="28"/>
-          <w:szCs w:val="28"/>
-          <w:lang w:val="el-GR"/>
-        </w:rPr>
-        <w:t>”</w:t>
-      </w:r>
-      <w:r>
-        <w:rPr>
-          <w:sz w:val="28"/>
-          <w:szCs w:val="28"/>
-          <w:lang w:val="el-GR"/>
-        </w:rPr>
-        <w:t xml:space="preserve"> στο </w:t>
-      </w:r>
-      <w:r>
-        <w:rPr>
+          <w:strike/>
+          <w:sz w:val="28"/>
+          <w:szCs w:val="28"/>
+          <w:lang w:val="el-GR"/>
+        </w:rPr>
+        <w:t xml:space="preserve">” στο </w:t>
+      </w:r>
+      <w:r>
+        <w:rPr>
+          <w:strike/>
           <w:sz w:val="28"/>
           <w:szCs w:val="28"/>
         </w:rPr>
@@ -2959,19 +4099,12 @@
       </w:r>
       <w:r>
         <w:rPr>
-          <w:sz w:val="28"/>
-          <w:szCs w:val="28"/>
-          <w:lang w:val="el-GR"/>
-        </w:rPr>
-        <w:t xml:space="preserve"> του χρήστη</w:t>
-      </w:r>
-      <w:r>
-        <w:rPr>
-          <w:sz w:val="28"/>
-          <w:szCs w:val="28"/>
-          <w:lang w:val="el-GR"/>
-        </w:rPr>
-        <w:t xml:space="preserve"> </w:t>
+          <w:strike/>
+          <w:sz w:val="28"/>
+          <w:szCs w:val="28"/>
+          <w:lang w:val="el-GR"/>
+        </w:rPr>
+        <w:t xml:space="preserve"> του χρήστη </w:t>
       </w:r>
       <w:r>
         <w:rPr>
@@ -3014,6 +4147,7 @@
       </w:r>
       <w:r>
         <w:rPr>
+          <w:strike/>
           <w:sz w:val="28"/>
           <w:szCs w:val="28"/>
           <w:highlight w:val="yellow"/>
@@ -3028,45 +4162,24 @@
           <w:bottom w:val="single" w:sz="6" w:space="1" w:color="auto"/>
         </w:pBdr>
         <w:rPr>
-          <w:sz w:val="28"/>
-          <w:szCs w:val="28"/>
-          <w:lang w:val="el-GR"/>
-        </w:rPr>
-      </w:pPr>
-      <w:r>
-        <w:rPr>
-          <w:sz w:val="28"/>
-          <w:szCs w:val="28"/>
-          <w:lang w:val="el-GR"/>
-        </w:rPr>
-        <w:t>11.α.3</w:t>
-      </w:r>
-      <w:r>
-        <w:rPr>
-          <w:sz w:val="28"/>
-          <w:szCs w:val="28"/>
-          <w:lang w:val="el-GR"/>
-        </w:rPr>
-        <w:t>.</w:t>
-      </w:r>
-      <w:r>
-        <w:rPr>
-          <w:sz w:val="28"/>
-          <w:szCs w:val="28"/>
-          <w:lang w:val="el-GR"/>
-        </w:rPr>
-        <w:t xml:space="preserve"> </w:t>
-      </w:r>
-      <w:r>
-        <w:rPr>
-          <w:sz w:val="28"/>
-          <w:szCs w:val="28"/>
-          <w:lang w:val="el-GR"/>
-        </w:rPr>
-        <w:t>Το σύστημα ανανεώνει την οθόνη της αγγελίας, αλλάζοντας την κατάσταση του κουμπιού σε “</w:t>
-      </w:r>
-      <w:r>
-        <w:rPr>
+          <w:strike/>
+          <w:sz w:val="28"/>
+          <w:szCs w:val="28"/>
+          <w:lang w:val="el-GR"/>
+        </w:rPr>
+      </w:pPr>
+      <w:r>
+        <w:rPr>
+          <w:strike/>
+          <w:sz w:val="28"/>
+          <w:szCs w:val="28"/>
+          <w:lang w:val="el-GR"/>
+        </w:rPr>
+        <w:t>11.α.3. Το σύστημα ανανεώνει την οθόνη της αγγελίας, αλλάζοντας την κατάσταση του κουμπιού σε “</w:t>
+      </w:r>
+      <w:r>
+        <w:rPr>
+          <w:strike/>
           <w:sz w:val="28"/>
           <w:szCs w:val="28"/>
         </w:rPr>
@@ -3074,19 +4187,12 @@
       </w:r>
       <w:r>
         <w:rPr>
-          <w:sz w:val="28"/>
-          <w:szCs w:val="28"/>
-          <w:lang w:val="el-GR"/>
-        </w:rPr>
-        <w:t>”</w:t>
-      </w:r>
-      <w:r>
-        <w:rPr>
-          <w:sz w:val="28"/>
-          <w:szCs w:val="28"/>
-          <w:lang w:val="el-GR"/>
-        </w:rPr>
-        <w:t>.</w:t>
+          <w:strike/>
+          <w:sz w:val="28"/>
+          <w:szCs w:val="28"/>
+          <w:lang w:val="el-GR"/>
+        </w:rPr>
+        <w:t>”.</w:t>
       </w:r>
     </w:p>
     <w:p>
@@ -3543,7 +4649,33 @@
           <w:szCs w:val="28"/>
           <w:lang w:val="el-GR"/>
         </w:rPr>
-        <w:t>επιλέγει την λειτουργεία</w:t>
+        <w:t xml:space="preserve">επιλέγει </w:t>
+      </w:r>
+      <w:r>
+        <w:rPr>
+          <w:strike/>
+          <w:sz w:val="28"/>
+          <w:szCs w:val="28"/>
+          <w:lang w:val="el-GR"/>
+        </w:rPr>
+        <w:t>την</w:t>
+      </w:r>
+      <w:r>
+        <w:rPr>
+          <w:sz w:val="28"/>
+          <w:szCs w:val="28"/>
+          <w:lang w:val="el-GR"/>
+        </w:rPr>
+        <w:t xml:space="preserve"> </w:t>
+      </w:r>
+      <w:r>
+        <w:rPr>
+          <w:strike/>
+          <w:sz w:val="28"/>
+          <w:szCs w:val="28"/>
+          <w:lang w:val="el-GR"/>
+        </w:rPr>
+        <w:t>λειτουργεία</w:t>
       </w:r>
       <w:r>
         <w:rPr>
@@ -3573,10 +4705,18 @@
         <w:rPr>
           <w:sz w:val="28"/>
           <w:szCs w:val="28"/>
-          <w:highlight w:val="red"/>
-          <w:lang w:val="el-GR"/>
-        </w:rPr>
-        <w:t>επιλέγοντας</w:t>
+          <w:lang w:val="el-GR"/>
+        </w:rPr>
+        <w:t xml:space="preserve"> </w:t>
+      </w:r>
+      <w:r>
+        <w:rPr>
+          <w:sz w:val="28"/>
+          <w:szCs w:val="28"/>
+          <w:highlight w:val="red"/>
+          <w:lang w:val="el-GR"/>
+        </w:rPr>
+        <w:t>πατώντας</w:t>
       </w:r>
       <w:r>
         <w:rPr>
@@ -3707,16 +4847,51 @@
           <w:szCs w:val="28"/>
           <w:lang w:val="el-GR"/>
         </w:rPr>
-        <w:t xml:space="preserve"> </w:t>
-      </w:r>
-      <w:r>
-        <w:rPr>
-          <w:sz w:val="28"/>
-          <w:szCs w:val="28"/>
-          <w:highlight w:val="red"/>
-          <w:lang w:val="el-GR"/>
-        </w:rPr>
-        <w:t>ο οποίος αποτελεί μέλος του δωματίου</w:t>
+        <w:t>.</w:t>
+      </w:r>
+      <w:r>
+        <w:rPr>
+          <w:sz w:val="28"/>
+          <w:szCs w:val="28"/>
+          <w:lang w:val="el-GR"/>
+        </w:rPr>
+        <w:t xml:space="preserve"> </w:t>
+      </w:r>
+      <w:r>
+        <w:rPr>
+          <w:sz w:val="28"/>
+          <w:szCs w:val="28"/>
+          <w:highlight w:val="red"/>
+          <w:lang w:val="el-GR"/>
+        </w:rPr>
+        <w:t xml:space="preserve">Ο </w:t>
+      </w:r>
+      <w:r>
+        <w:rPr>
+          <w:sz w:val="28"/>
+          <w:szCs w:val="28"/>
+          <w:highlight w:val="red"/>
+          <w:lang w:val="el-GR"/>
+        </w:rPr>
+        <w:t>χρήστης</w:t>
+      </w:r>
+      <w:r>
+        <w:rPr>
+          <w:sz w:val="28"/>
+          <w:szCs w:val="28"/>
+          <w:highlight w:val="red"/>
+          <w:lang w:val="el-GR"/>
+        </w:rPr>
+        <w:t xml:space="preserve"> αυτός</w:t>
+      </w:r>
+      <w:r>
+        <w:rPr>
+          <w:sz w:val="28"/>
+          <w:szCs w:val="28"/>
+          <w:highlight w:val="red"/>
+          <w:lang w:val="el-GR"/>
+        </w:rPr>
+        <w:t xml:space="preserve"> αποτελεί μέλος του δωματίου</w:t>
       </w:r>
       <w:r>
         <w:rPr>
@@ -3825,7 +5000,6 @@
           <w:szCs w:val="28"/>
           <w:lang w:val="el-GR"/>
         </w:rPr>
-        <w:lastRenderedPageBreak/>
         <w:t>Ο χρήστης στέλνει στον υποψήφιο συγκάτοικο</w:t>
       </w:r>
       <w:r>
@@ -4088,6 +5262,7 @@
           <w:szCs w:val="28"/>
           <w:lang w:val="el-GR"/>
         </w:rPr>
+        <w:lastRenderedPageBreak/>
         <w:t>Ο</w:t>
       </w:r>
       <w:r>
@@ -4232,15 +5407,13 @@
         <w:rPr>
           <w:sz w:val="28"/>
           <w:szCs w:val="28"/>
-          <w:u w:val="single"/>
-          <w:lang w:val="el-GR"/>
-        </w:rPr>
-      </w:pPr>
-      <w:r>
-        <w:rPr>
-          <w:sz w:val="28"/>
-          <w:szCs w:val="28"/>
-          <w:u w:val="single"/>
+          <w:lang w:val="el-GR"/>
+        </w:rPr>
+      </w:pPr>
+      <w:r>
+        <w:rPr>
+          <w:sz w:val="28"/>
+          <w:szCs w:val="28"/>
           <w:lang w:val="el-GR"/>
         </w:rPr>
         <w:t xml:space="preserve">Το σύστημα </w:t>
@@ -4249,7 +5422,6 @@
         <w:rPr>
           <w:sz w:val="28"/>
           <w:szCs w:val="28"/>
-          <w:u w:val="single"/>
           <w:lang w:val="el-GR"/>
         </w:rPr>
         <w:t>διακρίνει</w:t>
@@ -4258,16 +5430,14 @@
         <w:rPr>
           <w:sz w:val="28"/>
           <w:szCs w:val="28"/>
-          <w:u w:val="single"/>
-          <w:lang w:val="el-GR"/>
-        </w:rPr>
-        <w:t xml:space="preserve"> </w:t>
-      </w:r>
-      <w:r>
-        <w:rPr>
-          <w:sz w:val="28"/>
-          <w:szCs w:val="28"/>
-          <w:u w:val="single"/>
+          <w:lang w:val="el-GR"/>
+        </w:rPr>
+        <w:t xml:space="preserve"> </w:t>
+      </w:r>
+      <w:r>
+        <w:rPr>
+          <w:sz w:val="28"/>
+          <w:szCs w:val="28"/>
           <w:lang w:val="el-GR"/>
         </w:rPr>
         <w:t>ότι</w:t>
@@ -4276,7 +5446,6 @@
         <w:rPr>
           <w:sz w:val="28"/>
           <w:szCs w:val="28"/>
-          <w:u w:val="single"/>
           <w:lang w:val="el-GR"/>
         </w:rPr>
         <w:t xml:space="preserve"> ο κωδικός (</w:t>
@@ -4285,7 +5454,6 @@
         <w:rPr>
           <w:sz w:val="28"/>
           <w:szCs w:val="28"/>
-          <w:u w:val="single"/>
         </w:rPr>
         <w:t>id</w:t>
       </w:r>
@@ -4293,16 +5461,38 @@
         <w:rPr>
           <w:sz w:val="28"/>
           <w:szCs w:val="28"/>
-          <w:u w:val="single"/>
-          <w:lang w:val="el-GR"/>
-        </w:rPr>
-        <w:t>) αντιστοιχεί σε κάποιο σπίτι που βρίσκεται στην βάση της εφαρμογής</w:t>
-      </w:r>
-      <w:r>
-        <w:rPr>
-          <w:sz w:val="28"/>
-          <w:szCs w:val="28"/>
-          <w:u w:val="single"/>
+          <w:lang w:val="el-GR"/>
+        </w:rPr>
+        <w:t xml:space="preserve">) αντιστοιχεί σε κάποιο </w:t>
+      </w:r>
+      <w:r>
+        <w:rPr>
+          <w:sz w:val="28"/>
+          <w:szCs w:val="28"/>
+          <w:lang w:val="el-GR"/>
+        </w:rPr>
+        <w:t>δωμάτιο</w:t>
+      </w:r>
+      <w:r>
+        <w:rPr>
+          <w:sz w:val="28"/>
+          <w:szCs w:val="28"/>
+          <w:lang w:val="el-GR"/>
+        </w:rPr>
+        <w:t xml:space="preserve"> </w:t>
+      </w:r>
+      <w:r>
+        <w:rPr>
+          <w:sz w:val="28"/>
+          <w:szCs w:val="28"/>
+          <w:lang w:val="el-GR"/>
+        </w:rPr>
+        <w:t>που βρίσκεται στην βάση της εφαρμογής</w:t>
+      </w:r>
+      <w:r>
+        <w:rPr>
+          <w:sz w:val="28"/>
+          <w:szCs w:val="28"/>
           <w:lang w:val="el-GR"/>
         </w:rPr>
         <w:t>.</w:t>
@@ -4311,7 +5501,6 @@
         <w:rPr>
           <w:sz w:val="28"/>
           <w:szCs w:val="28"/>
-          <w:u w:val="single"/>
           <w:lang w:val="el-GR"/>
         </w:rPr>
         <w:t xml:space="preserve"> </w:t>
@@ -4871,7 +6060,32 @@
           <w:szCs w:val="28"/>
           <w:lang w:val="el-GR"/>
         </w:rPr>
-        <w:t>) δεν βρεθεί.</w:t>
+        <w:t>) δεν βρεθεί</w:t>
+      </w:r>
+      <w:r>
+        <w:rPr>
+          <w:sz w:val="28"/>
+          <w:szCs w:val="28"/>
+          <w:lang w:val="el-GR"/>
+        </w:rPr>
+        <w:t xml:space="preserve"> </w:t>
+      </w:r>
+      <w:r>
+        <w:rPr>
+          <w:sz w:val="28"/>
+          <w:szCs w:val="28"/>
+          <w:highlight w:val="red"/>
+          <w:lang w:val="el-GR"/>
+        </w:rPr>
+        <w:t>ή είναι ήδη γεμάτο</w:t>
+      </w:r>
+      <w:r>
+        <w:rPr>
+          <w:sz w:val="28"/>
+          <w:szCs w:val="28"/>
+          <w:lang w:val="el-GR"/>
+        </w:rPr>
+        <w:t>.</w:t>
       </w:r>
     </w:p>
     <w:p>
@@ -5111,7 +6325,6 @@
           <w:szCs w:val="28"/>
           <w:lang w:val="el-GR"/>
         </w:rPr>
-        <w:lastRenderedPageBreak/>
         <w:t xml:space="preserve">7.α.2. Το σύστημα </w:t>
       </w:r>
       <w:r>
@@ -7298,6 +8511,44 @@
       <w14:ligatures w14:val="none"/>
     </w:rPr>
   </w:style>
+  <w:style w:type="paragraph" w:customStyle="1" w:styleId="Default">
+    <w:name w:val="Default"/>
+    <w:rsid w:val="00433F89"/>
+    <w:pPr>
+      <w:autoSpaceDE w:val="0"/>
+      <w:autoSpaceDN w:val="0"/>
+      <w:adjustRightInd w:val="0"/>
+      <w:spacing w:after="0" w:line="240" w:lineRule="auto"/>
+    </w:pPr>
+    <w:rPr>
+      <w:rFonts w:ascii="Calibri" w:hAnsi="Calibri" w:cs="Calibri"/>
+      <w:color w:val="000000"/>
+      <w:kern w:val="0"/>
+    </w:rPr>
+  </w:style>
+  <w:style w:type="character" w:styleId="Hyperlink">
+    <w:name w:val="Hyperlink"/>
+    <w:basedOn w:val="DefaultParagraphFont"/>
+    <w:uiPriority w:val="99"/>
+    <w:unhideWhenUsed/>
+    <w:rsid w:val="003459DF"/>
+    <w:rPr>
+      <w:color w:val="467886" w:themeColor="hyperlink"/>
+      <w:u w:val="single"/>
+    </w:rPr>
+  </w:style>
+  <w:style w:type="character" w:styleId="UnresolvedMention">
+    <w:name w:val="Unresolved Mention"/>
+    <w:basedOn w:val="DefaultParagraphFont"/>
+    <w:uiPriority w:val="99"/>
+    <w:semiHidden/>
+    <w:unhideWhenUsed/>
+    <w:rsid w:val="003459DF"/>
+    <w:rPr>
+      <w:color w:val="605E5C"/>
+      <w:shd w:val="clear" w:color="auto" w:fill="E1DFDD"/>
+    </w:rPr>
+  </w:style>
 </w:styles>
 </file>
 

</xml_diff>